<commit_message>
docs: align technical design with CHAR(36) schema
</commit_message>
<xml_diff>
--- a/TECHNICAL_DESIGN.docx
+++ b/TECHNICAL_DESIGN.docx
@@ -18,7 +18,7 @@
           <w:i/>
           <w:sz w:val="20"/>
         </w:rPr>
-        <w:t>Generated from TECHNICAL_DESIGN.md on 2026-05-06 08:55</w:t>
+        <w:t>Generated from TECHNICAL_DESIGN.md on 2026-05-06 09:16</w:t>
       </w:r>
     </w:p>
     <w:p>
@@ -34,17 +34,17 @@
     <w:p/>
     <w:p>
       <w:r>
-        <w:t>Version: 1.0</w:t>
+        <w:t>Version: 1.1</w:t>
       </w:r>
     </w:p>
     <w:p>
       <w:r>
-        <w:t>Date: April 28, 2026</w:t>
+        <w:t>Date: May 6, 2026</w:t>
       </w:r>
     </w:p>
     <w:p>
       <w:r>
-        <w:t>Status: Current</w:t>
+        <w:t>Status: Updated</w:t>
       </w:r>
     </w:p>
     <w:p/>
@@ -474,9 +474,7 @@
         <w:br/>
         <w:t xml:space="preserve">  assets/js/app.js       &lt;-  All frontend JavaScript</w:t>
         <w:br/>
-        <w:t xml:space="preserve">  api-docs/openapi.json  &lt;-  OpenAPI 3.0 specification</w:t>
-        <w:br/>
-        <w:t>uploads/                 &lt;-  Uploaded attachment files (not web-accessible directly)</w:t>
+        <w:t>anonymous_feedback_private_uploads/ &lt;- Private attachment storage (not web-accessible directly)</w:t>
       </w:r>
     </w:p>
     <w:p/>
@@ -650,7 +648,7 @@
         <w:br/>
         <w:t xml:space="preserve">  CATEGORIES {</w:t>
         <w:br/>
-        <w:t xml:space="preserve">    int id PK</w:t>
+        <w:t xml:space="preserve">    string id PK</w:t>
         <w:br/>
         <w:t xml:space="preserve">    string name</w:t>
         <w:br/>
@@ -662,7 +660,7 @@
         <w:br/>
         <w:t xml:space="preserve">  STATUSES {</w:t>
         <w:br/>
-        <w:t xml:space="preserve">    int id PK</w:t>
+        <w:t xml:space="preserve">    string id PK</w:t>
         <w:br/>
         <w:t xml:space="preserve">    string name</w:t>
         <w:br/>
@@ -674,7 +672,7 @@
         <w:br/>
         <w:t xml:space="preserve">  STAGES {</w:t>
         <w:br/>
-        <w:t xml:space="preserve">    int id PK</w:t>
+        <w:t xml:space="preserve">    string id PK</w:t>
         <w:br/>
         <w:t xml:space="preserve">    string name</w:t>
         <w:br/>
@@ -686,15 +684,15 @@
         <w:br/>
         <w:t xml:space="preserve">  FEEDBACKS {</w:t>
         <w:br/>
-        <w:t xml:space="preserve">    bigint id PK</w:t>
+        <w:t xml:space="preserve">    string id PK</w:t>
         <w:br/>
         <w:t xml:space="preserve">    string reference_no</w:t>
         <w:br/>
-        <w:t xml:space="preserve">    int category_id FK</w:t>
+        <w:t xml:space="preserve">    string category_id FK</w:t>
         <w:br/>
-        <w:t xml:space="preserve">    int status_id FK</w:t>
+        <w:t xml:space="preserve">    string status_id FK</w:t>
         <w:br/>
-        <w:t xml:space="preserve">    int stage_id FK</w:t>
+        <w:t xml:space="preserve">    string stage_id FK</w:t>
         <w:br/>
         <w:t xml:space="preserve">    string priority</w:t>
         <w:br/>
@@ -702,9 +700,9 @@
         <w:br/>
         <w:t xml:space="preserve">  REPORT_UPDATES {</w:t>
         <w:br/>
-        <w:t xml:space="preserve">    bigint id PK</w:t>
+        <w:t xml:space="preserve">    string id PK</w:t>
         <w:br/>
-        <w:t xml:space="preserve">    bigint feedback_id FK</w:t>
+        <w:t xml:space="preserve">    string feedback_id FK</w:t>
         <w:br/>
         <w:t xml:space="preserve">    string update_reference_no</w:t>
         <w:br/>
@@ -712,11 +710,11 @@
         <w:br/>
         <w:t xml:space="preserve">  ATTACHMENTS {</w:t>
         <w:br/>
-        <w:t xml:space="preserve">    bigint id PK</w:t>
+        <w:t xml:space="preserve">    string id PK</w:t>
         <w:br/>
-        <w:t xml:space="preserve">    bigint feedback_id FK</w:t>
+        <w:t xml:space="preserve">    string feedback_id FK</w:t>
         <w:br/>
-        <w:t xml:space="preserve">    bigint report_update_id FK</w:t>
+        <w:t xml:space="preserve">    string report_update_id FK</w:t>
         <w:br/>
         <w:t xml:space="preserve">    string stored_name</w:t>
         <w:br/>
@@ -726,9 +724,9 @@
         <w:br/>
         <w:t xml:space="preserve">  NOTIFICATIONS {</w:t>
         <w:br/>
-        <w:t xml:space="preserve">    bigint id PK</w:t>
+        <w:t xml:space="preserve">    string id PK</w:t>
         <w:br/>
-        <w:t xml:space="preserve">    bigint feedback_id FK</w:t>
+        <w:t xml:space="preserve">    string feedback_id FK</w:t>
         <w:br/>
         <w:t xml:space="preserve">    string kind</w:t>
         <w:br/>
@@ -738,11 +736,11 @@
         <w:br/>
         <w:t xml:space="preserve">  AUDIT_LOGS {</w:t>
         <w:br/>
-        <w:t xml:space="preserve">    bigint id PK</w:t>
+        <w:t xml:space="preserve">    string id PK</w:t>
         <w:br/>
-        <w:t xml:space="preserve">    bigint feedback_id FK</w:t>
+        <w:t xml:space="preserve">    string feedback_id FK</w:t>
         <w:br/>
-        <w:t xml:space="preserve">    int actor_user_id FK</w:t>
+        <w:t xml:space="preserve">    string actor_user_id FK</w:t>
         <w:br/>
         <w:t xml:space="preserve">    string action</w:t>
         <w:br/>
@@ -752,7 +750,7 @@
         <w:br/>
         <w:t xml:space="preserve">  USERS {</w:t>
         <w:br/>
-        <w:t xml:space="preserve">    int id PK</w:t>
+        <w:t xml:space="preserve">    string id PK</w:t>
         <w:br/>
         <w:t xml:space="preserve">    string email</w:t>
         <w:br/>
@@ -764,7 +762,7 @@
         <w:br/>
         <w:t xml:space="preserve">  LOGIN_ATTEMPTS {</w:t>
         <w:br/>
-        <w:t xml:space="preserve">    int id PK</w:t>
+        <w:t xml:space="preserve">    string id PK</w:t>
         <w:br/>
         <w:t xml:space="preserve">    string ip</w:t>
         <w:br/>
@@ -853,17 +851,17 @@
           </w:tcPr>
           <w:p>
             <w:r>
-              <w:t>INT UNSIGNED PK</w:t>
-            </w:r>
-          </w:p>
-        </w:tc>
-        <w:tc>
-          <w:tcPr>
-            <w:tcW w:type="dxa" w:w="2880"/>
-          </w:tcPr>
-          <w:p>
-            <w:r>
-              <w:t>Auto-increment</w:t>
+              <w:t>CHAR(36) PK</w:t>
+            </w:r>
+          </w:p>
+        </w:tc>
+        <w:tc>
+          <w:tcPr>
+            <w:tcW w:type="dxa" w:w="2880"/>
+          </w:tcPr>
+          <w:p>
+            <w:r>
+              <w:t>UUID</w:t>
             </w:r>
           </w:p>
         </w:tc>
@@ -928,6 +926,70 @@
           <w:p>
             <w:r>
               <w:t>1 = available for use by HR</w:t>
+            </w:r>
+          </w:p>
+        </w:tc>
+      </w:tr>
+      <w:tr>
+        <w:tc>
+          <w:tcPr>
+            <w:tcW w:type="dxa" w:w="2880"/>
+          </w:tcPr>
+          <w:p>
+            <w:r>
+              <w:t>created_by_user_id</w:t>
+            </w:r>
+          </w:p>
+        </w:tc>
+        <w:tc>
+          <w:tcPr>
+            <w:tcW w:type="dxa" w:w="2880"/>
+          </w:tcPr>
+          <w:p>
+            <w:r>
+              <w:t>CHAR(36) NULL</w:t>
+            </w:r>
+          </w:p>
+        </w:tc>
+        <w:tc>
+          <w:tcPr>
+            <w:tcW w:type="dxa" w:w="2880"/>
+          </w:tcPr>
+          <w:p>
+            <w:r>
+              <w:t>FK -&gt; users(id), ON DELETE SET NULL</w:t>
+            </w:r>
+          </w:p>
+        </w:tc>
+      </w:tr>
+      <w:tr>
+        <w:tc>
+          <w:tcPr>
+            <w:tcW w:type="dxa" w:w="2880"/>
+          </w:tcPr>
+          <w:p>
+            <w:r>
+              <w:t>updated_by_user_id</w:t>
+            </w:r>
+          </w:p>
+        </w:tc>
+        <w:tc>
+          <w:tcPr>
+            <w:tcW w:type="dxa" w:w="2880"/>
+          </w:tcPr>
+          <w:p>
+            <w:r>
+              <w:t>CHAR(36) NULL</w:t>
+            </w:r>
+          </w:p>
+        </w:tc>
+        <w:tc>
+          <w:tcPr>
+            <w:tcW w:type="dxa" w:w="2880"/>
+          </w:tcPr>
+          <w:p>
+            <w:r>
+              <w:t>FK -&gt; users(id), ON DELETE SET NULL</w:t>
             </w:r>
           </w:p>
         </w:tc>
@@ -1100,17 +1162,17 @@
           </w:tcPr>
           <w:p>
             <w:r>
-              <w:t>INT UNSIGNED PK</w:t>
-            </w:r>
-          </w:p>
-        </w:tc>
-        <w:tc>
-          <w:tcPr>
-            <w:tcW w:type="dxa" w:w="2880"/>
-          </w:tcPr>
-          <w:p>
-            <w:r>
-              <w:t>Auto-increment</w:t>
+              <w:t>CHAR(36) PK</w:t>
+            </w:r>
+          </w:p>
+        </w:tc>
+        <w:tc>
+          <w:tcPr>
+            <w:tcW w:type="dxa" w:w="2880"/>
+          </w:tcPr>
+          <w:p>
+            <w:r>
+              <w:t>UUID</w:t>
             </w:r>
           </w:p>
         </w:tc>
@@ -1175,6 +1237,70 @@
           <w:p>
             <w:r>
               <w:t>1 = shown to employees</w:t>
+            </w:r>
+          </w:p>
+        </w:tc>
+      </w:tr>
+      <w:tr>
+        <w:tc>
+          <w:tcPr>
+            <w:tcW w:type="dxa" w:w="2880"/>
+          </w:tcPr>
+          <w:p>
+            <w:r>
+              <w:t>created_by_user_id</w:t>
+            </w:r>
+          </w:p>
+        </w:tc>
+        <w:tc>
+          <w:tcPr>
+            <w:tcW w:type="dxa" w:w="2880"/>
+          </w:tcPr>
+          <w:p>
+            <w:r>
+              <w:t>CHAR(36) NULL</w:t>
+            </w:r>
+          </w:p>
+        </w:tc>
+        <w:tc>
+          <w:tcPr>
+            <w:tcW w:type="dxa" w:w="2880"/>
+          </w:tcPr>
+          <w:p>
+            <w:r>
+              <w:t>FK -&gt; users(id), ON DELETE SET NULL</w:t>
+            </w:r>
+          </w:p>
+        </w:tc>
+      </w:tr>
+      <w:tr>
+        <w:tc>
+          <w:tcPr>
+            <w:tcW w:type="dxa" w:w="2880"/>
+          </w:tcPr>
+          <w:p>
+            <w:r>
+              <w:t>updated_by_user_id</w:t>
+            </w:r>
+          </w:p>
+        </w:tc>
+        <w:tc>
+          <w:tcPr>
+            <w:tcW w:type="dxa" w:w="2880"/>
+          </w:tcPr>
+          <w:p>
+            <w:r>
+              <w:t>CHAR(36) NULL</w:t>
+            </w:r>
+          </w:p>
+        </w:tc>
+        <w:tc>
+          <w:tcPr>
+            <w:tcW w:type="dxa" w:w="2880"/>
+          </w:tcPr>
+          <w:p>
+            <w:r>
+              <w:t>FK -&gt; users(id), ON DELETE SET NULL</w:t>
             </w:r>
           </w:p>
         </w:tc>
@@ -1341,17 +1467,17 @@
           </w:tcPr>
           <w:p>
             <w:r>
-              <w:t>INT UNSIGNED PK</w:t>
-            </w:r>
-          </w:p>
-        </w:tc>
-        <w:tc>
-          <w:tcPr>
-            <w:tcW w:type="dxa" w:w="2880"/>
-          </w:tcPr>
-          <w:p>
-            <w:r>
-              <w:t>Auto-increment</w:t>
+              <w:t>CHAR(36) PK</w:t>
+            </w:r>
+          </w:p>
+        </w:tc>
+        <w:tc>
+          <w:tcPr>
+            <w:tcW w:type="dxa" w:w="2880"/>
+          </w:tcPr>
+          <w:p>
+            <w:r>
+              <w:t>UUID</w:t>
             </w:r>
           </w:p>
         </w:tc>
@@ -1416,6 +1542,70 @@
           <w:p>
             <w:r>
               <w:t>1 = usable by HR</w:t>
+            </w:r>
+          </w:p>
+        </w:tc>
+      </w:tr>
+      <w:tr>
+        <w:tc>
+          <w:tcPr>
+            <w:tcW w:type="dxa" w:w="2880"/>
+          </w:tcPr>
+          <w:p>
+            <w:r>
+              <w:t>created_by_user_id</w:t>
+            </w:r>
+          </w:p>
+        </w:tc>
+        <w:tc>
+          <w:tcPr>
+            <w:tcW w:type="dxa" w:w="2880"/>
+          </w:tcPr>
+          <w:p>
+            <w:r>
+              <w:t>CHAR(36) NULL</w:t>
+            </w:r>
+          </w:p>
+        </w:tc>
+        <w:tc>
+          <w:tcPr>
+            <w:tcW w:type="dxa" w:w="2880"/>
+          </w:tcPr>
+          <w:p>
+            <w:r>
+              <w:t>FK -&gt; users(id), ON DELETE SET NULL</w:t>
+            </w:r>
+          </w:p>
+        </w:tc>
+      </w:tr>
+      <w:tr>
+        <w:tc>
+          <w:tcPr>
+            <w:tcW w:type="dxa" w:w="2880"/>
+          </w:tcPr>
+          <w:p>
+            <w:r>
+              <w:t>updated_by_user_id</w:t>
+            </w:r>
+          </w:p>
+        </w:tc>
+        <w:tc>
+          <w:tcPr>
+            <w:tcW w:type="dxa" w:w="2880"/>
+          </w:tcPr>
+          <w:p>
+            <w:r>
+              <w:t>CHAR(36) NULL</w:t>
+            </w:r>
+          </w:p>
+        </w:tc>
+        <w:tc>
+          <w:tcPr>
+            <w:tcW w:type="dxa" w:w="2880"/>
+          </w:tcPr>
+          <w:p>
+            <w:r>
+              <w:t>FK -&gt; users(id), ON DELETE SET NULL</w:t>
             </w:r>
           </w:p>
         </w:tc>
@@ -1582,17 +1772,17 @@
           </w:tcPr>
           <w:p>
             <w:r>
-              <w:t>BIGINT UNSIGNED PK</w:t>
-            </w:r>
-          </w:p>
-        </w:tc>
-        <w:tc>
-          <w:tcPr>
-            <w:tcW w:type="dxa" w:w="2880"/>
-          </w:tcPr>
-          <w:p>
-            <w:r>
-              <w:t>Auto-increment</w:t>
+              <w:t>CHAR(36) PK</w:t>
+            </w:r>
+          </w:p>
+        </w:tc>
+        <w:tc>
+          <w:tcPr>
+            <w:tcW w:type="dxa" w:w="2880"/>
+          </w:tcPr>
+          <w:p>
+            <w:r>
+              <w:t>UUID</w:t>
             </w:r>
           </w:p>
         </w:tc>
@@ -1646,7 +1836,7 @@
           </w:tcPr>
           <w:p>
             <w:r>
-              <w:t>INT UNSIGNED NOT NULL</w:t>
+              <w:t>CHAR(36) NOT NULL</w:t>
             </w:r>
           </w:p>
         </w:tc>
@@ -1742,7 +1932,7 @@
           </w:tcPr>
           <w:p>
             <w:r>
-              <w:t>INT UNSIGNED NOT NULL</w:t>
+              <w:t>CHAR(36) NOT NULL</w:t>
             </w:r>
           </w:p>
         </w:tc>
@@ -1774,7 +1964,7 @@
           </w:tcPr>
           <w:p>
             <w:r>
-              <w:t>INT UNSIGNED NOT NULL</w:t>
+              <w:t>CHAR(36) NOT NULL</w:t>
             </w:r>
           </w:p>
         </w:tc>
@@ -1785,6 +1975,102 @@
           <w:p>
             <w:r>
               <w:t>FK  -&gt;  stages(id)</w:t>
+            </w:r>
+          </w:p>
+        </w:tc>
+      </w:tr>
+      <w:tr>
+        <w:tc>
+          <w:tcPr>
+            <w:tcW w:type="dxa" w:w="2880"/>
+          </w:tcPr>
+          <w:p>
+            <w:r>
+              <w:t>assigned_to_user_id</w:t>
+            </w:r>
+          </w:p>
+        </w:tc>
+        <w:tc>
+          <w:tcPr>
+            <w:tcW w:type="dxa" w:w="2880"/>
+          </w:tcPr>
+          <w:p>
+            <w:r>
+              <w:t>CHAR(36) NULL</w:t>
+            </w:r>
+          </w:p>
+        </w:tc>
+        <w:tc>
+          <w:tcPr>
+            <w:tcW w:type="dxa" w:w="2880"/>
+          </w:tcPr>
+          <w:p>
+            <w:r>
+              <w:t>FK -&gt; users(id), ON DELETE SET NULL</w:t>
+            </w:r>
+          </w:p>
+        </w:tc>
+      </w:tr>
+      <w:tr>
+        <w:tc>
+          <w:tcPr>
+            <w:tcW w:type="dxa" w:w="2880"/>
+          </w:tcPr>
+          <w:p>
+            <w:r>
+              <w:t>assigned_at</w:t>
+            </w:r>
+          </w:p>
+        </w:tc>
+        <w:tc>
+          <w:tcPr>
+            <w:tcW w:type="dxa" w:w="2880"/>
+          </w:tcPr>
+          <w:p>
+            <w:r>
+              <w:t>DATETIME NULL</w:t>
+            </w:r>
+          </w:p>
+        </w:tc>
+        <w:tc>
+          <w:tcPr>
+            <w:tcW w:type="dxa" w:w="2880"/>
+          </w:tcPr>
+          <w:p>
+            <w:r>
+              <w:t>Timestamp when assigned</w:t>
+            </w:r>
+          </w:p>
+        </w:tc>
+      </w:tr>
+      <w:tr>
+        <w:tc>
+          <w:tcPr>
+            <w:tcW w:type="dxa" w:w="2880"/>
+          </w:tcPr>
+          <w:p>
+            <w:r>
+              <w:t>updated_by_user_id</w:t>
+            </w:r>
+          </w:p>
+        </w:tc>
+        <w:tc>
+          <w:tcPr>
+            <w:tcW w:type="dxa" w:w="2880"/>
+          </w:tcPr>
+          <w:p>
+            <w:r>
+              <w:t>CHAR(36) NULL</w:t>
+            </w:r>
+          </w:p>
+        </w:tc>
+        <w:tc>
+          <w:tcPr>
+            <w:tcW w:type="dxa" w:w="2880"/>
+          </w:tcPr>
+          <w:p>
+            <w:r>
+              <w:t>FK -&gt; users(id), ON DELETE SET NULL</w:t>
             </w:r>
           </w:p>
         </w:tc>
@@ -2133,16 +2419,18 @@
           </w:tcPr>
           <w:p>
             <w:r>
-              <w:t>BIGINT UNSIGNED PK</w:t>
-            </w:r>
-          </w:p>
-        </w:tc>
-        <w:tc>
-          <w:tcPr>
-            <w:tcW w:type="dxa" w:w="2880"/>
-          </w:tcPr>
-          <w:p>
-            <w:r/>
+              <w:t>CHAR(36) PK</w:t>
+            </w:r>
+          </w:p>
+        </w:tc>
+        <w:tc>
+          <w:tcPr>
+            <w:tcW w:type="dxa" w:w="2880"/>
+          </w:tcPr>
+          <w:p>
+            <w:r>
+              <w:t>UUID</w:t>
+            </w:r>
           </w:p>
         </w:tc>
       </w:tr>
@@ -2163,7 +2451,7 @@
           </w:tcPr>
           <w:p>
             <w:r>
-              <w:t>BIGINT UNSIGNED NOT NULL</w:t>
+              <w:t>CHAR(36) NOT NULL</w:t>
             </w:r>
           </w:p>
         </w:tc>
@@ -2342,16 +2630,18 @@
           </w:tcPr>
           <w:p>
             <w:r>
-              <w:t>BIGINT UNSIGNED PK</w:t>
-            </w:r>
-          </w:p>
-        </w:tc>
-        <w:tc>
-          <w:tcPr>
-            <w:tcW w:type="dxa" w:w="2880"/>
-          </w:tcPr>
-          <w:p>
-            <w:r/>
+              <w:t>CHAR(36) PK</w:t>
+            </w:r>
+          </w:p>
+        </w:tc>
+        <w:tc>
+          <w:tcPr>
+            <w:tcW w:type="dxa" w:w="2880"/>
+          </w:tcPr>
+          <w:p>
+            <w:r>
+              <w:t>UUID</w:t>
+            </w:r>
           </w:p>
         </w:tc>
       </w:tr>
@@ -2372,7 +2662,7 @@
           </w:tcPr>
           <w:p>
             <w:r>
-              <w:t>BIGINT UNSIGNED NULL</w:t>
+              <w:t>CHAR(36) NULL</w:t>
             </w:r>
           </w:p>
         </w:tc>
@@ -2404,7 +2694,7 @@
           </w:tcPr>
           <w:p>
             <w:r>
-              <w:t>BIGINT UNSIGNED NULL</w:t>
+              <w:t>CHAR(36) NULL</w:t>
             </w:r>
           </w:p>
         </w:tc>
@@ -2643,16 +2933,18 @@
           </w:tcPr>
           <w:p>
             <w:r>
-              <w:t>BIGINT UNSIGNED PK</w:t>
-            </w:r>
-          </w:p>
-        </w:tc>
-        <w:tc>
-          <w:tcPr>
-            <w:tcW w:type="dxa" w:w="2880"/>
-          </w:tcPr>
-          <w:p>
-            <w:r/>
+              <w:t>CHAR(36) PK</w:t>
+            </w:r>
+          </w:p>
+        </w:tc>
+        <w:tc>
+          <w:tcPr>
+            <w:tcW w:type="dxa" w:w="2880"/>
+          </w:tcPr>
+          <w:p>
+            <w:r>
+              <w:t>UUID</w:t>
+            </w:r>
           </w:p>
         </w:tc>
       </w:tr>
@@ -2673,7 +2965,7 @@
           </w:tcPr>
           <w:p>
             <w:r>
-              <w:t>BIGINT UNSIGNED NULL</w:t>
+              <w:t>CHAR(36) NULL</w:t>
             </w:r>
           </w:p>
         </w:tc>
@@ -2705,7 +2997,7 @@
           </w:tcPr>
           <w:p>
             <w:r>
-              <w:t>INT NULL</w:t>
+              <w:t>CHAR(36) NULL</w:t>
             </w:r>
           </w:p>
         </w:tc>
@@ -2962,16 +3254,18 @@
           </w:tcPr>
           <w:p>
             <w:r>
-              <w:t>BIGINT UNSIGNED PK</w:t>
-            </w:r>
-          </w:p>
-        </w:tc>
-        <w:tc>
-          <w:tcPr>
-            <w:tcW w:type="dxa" w:w="2880"/>
-          </w:tcPr>
-          <w:p>
-            <w:r/>
+              <w:t>CHAR(36) PK</w:t>
+            </w:r>
+          </w:p>
+        </w:tc>
+        <w:tc>
+          <w:tcPr>
+            <w:tcW w:type="dxa" w:w="2880"/>
+          </w:tcPr>
+          <w:p>
+            <w:r>
+              <w:t>UUID</w:t>
+            </w:r>
           </w:p>
         </w:tc>
       </w:tr>
@@ -2992,7 +3286,7 @@
           </w:tcPr>
           <w:p>
             <w:r>
-              <w:t>BIGINT UNSIGNED NOT NULL</w:t>
+              <w:t>CHAR(36) NOT NULL</w:t>
             </w:r>
           </w:p>
         </w:tc>
@@ -3171,16 +3465,18 @@
           </w:tcPr>
           <w:p>
             <w:r>
-              <w:t>INT PK</w:t>
-            </w:r>
-          </w:p>
-        </w:tc>
-        <w:tc>
-          <w:tcPr>
-            <w:tcW w:type="dxa" w:w="2880"/>
-          </w:tcPr>
-          <w:p>
-            <w:r/>
+              <w:t>CHAR(36) PK</w:t>
+            </w:r>
+          </w:p>
+        </w:tc>
+        <w:tc>
+          <w:tcPr>
+            <w:tcW w:type="dxa" w:w="2880"/>
+          </w:tcPr>
+          <w:p>
+            <w:r>
+              <w:t>UUID</w:t>
+            </w:r>
           </w:p>
         </w:tc>
       </w:tr>
@@ -3293,7 +3589,7 @@
           </w:tcPr>
           <w:p>
             <w:r>
-              <w:t>ENUM('hr','ethics')</w:t>
+              <w:t>ENUM('hr','ethics','manager','officer')</w:t>
             </w:r>
           </w:p>
         </w:tc>
@@ -3323,7 +3619,7 @@
           </w:tcPr>
           <w:p>
             <w:r>
-              <w:t>BOOLEAN</w:t>
+              <w:t>TINYINT(1)</w:t>
             </w:r>
           </w:p>
         </w:tc>
@@ -3353,7 +3649,7 @@
           </w:tcPr>
           <w:p>
             <w:r>
-              <w:t>TIMESTAMP</w:t>
+              <w:t>DATETIME</w:t>
             </w:r>
           </w:p>
         </w:tc>
@@ -3436,16 +3732,18 @@
           </w:tcPr>
           <w:p>
             <w:r>
-              <w:t>INT UNSIGNED PK</w:t>
-            </w:r>
-          </w:p>
-        </w:tc>
-        <w:tc>
-          <w:tcPr>
-            <w:tcW w:type="dxa" w:w="2880"/>
-          </w:tcPr>
-          <w:p>
-            <w:r/>
+              <w:t>CHAR(36) PK</w:t>
+            </w:r>
+          </w:p>
+        </w:tc>
+        <w:tc>
+          <w:tcPr>
+            <w:tcW w:type="dxa" w:w="2880"/>
+          </w:tcPr>
+          <w:p>
+            <w:r>
+              <w:t>UUID</w:t>
+            </w:r>
           </w:p>
         </w:tc>
       </w:tr>
@@ -3558,7 +3856,7 @@
         <w:pStyle w:val="Heading3"/>
       </w:pPr>
       <w:r>
-        <w:t>Public Endpoints (available in both modes)</w:t>
+        <w:t>Public Endpoints - External (external/index.php)</w:t>
       </w:r>
     </w:p>
     <w:p/>
@@ -3750,17 +4048,17 @@
           </w:tcPr>
           <w:p>
             <w:r>
-              <w:t>/api/reports</w:t>
-            </w:r>
-          </w:p>
-        </w:tc>
-        <w:tc>
-          <w:tcPr>
-            <w:tcW w:type="dxa" w:w="2880"/>
-          </w:tcPr>
-          <w:p>
-            <w:r>
-              <w:t>Public anonymized reports (filterable)</w:t>
+              <w:t>/api/attachments/{id}</w:t>
+            </w:r>
+          </w:p>
+        </w:tc>
+        <w:tc>
+          <w:tcPr>
+            <w:tcW w:type="dxa" w:w="2880"/>
+          </w:tcPr>
+          <w:p>
+            <w:r>
+              <w:t>Download an attachment by ID</w:t>
             </w:r>
           </w:p>
         </w:tc>
@@ -3782,17 +4080,17 @@
           </w:tcPr>
           <w:p>
             <w:r>
-              <w:t>/api/attachments/{id}</w:t>
-            </w:r>
-          </w:p>
-        </w:tc>
-        <w:tc>
-          <w:tcPr>
-            <w:tcW w:type="dxa" w:w="2880"/>
-          </w:tcPr>
-          <w:p>
-            <w:r>
-              <w:t>Download an attachment by ID</w:t>
+              <w:t>/api/categories</w:t>
+            </w:r>
+          </w:p>
+        </w:tc>
+        <w:tc>
+          <w:tcPr>
+            <w:tcW w:type="dxa" w:w="2880"/>
+          </w:tcPr>
+          <w:p>
+            <w:r>
+              <w:t>List active categories (for dropdown)</w:t>
             </w:r>
           </w:p>
         </w:tc>
@@ -3814,17 +4112,71 @@
           </w:tcPr>
           <w:p>
             <w:r>
-              <w:t>/api/categories</w:t>
-            </w:r>
-          </w:p>
-        </w:tc>
-        <w:tc>
-          <w:tcPr>
-            <w:tcW w:type="dxa" w:w="2880"/>
-          </w:tcPr>
-          <w:p>
-            <w:r>
-              <w:t>List active categories (for dropdown)</w:t>
+              <w:t>/api/statuses</w:t>
+            </w:r>
+          </w:p>
+        </w:tc>
+        <w:tc>
+          <w:tcPr>
+            <w:tcW w:type="dxa" w:w="2880"/>
+          </w:tcPr>
+          <w:p>
+            <w:r>
+              <w:t>List active statuses</w:t>
+            </w:r>
+          </w:p>
+        </w:tc>
+      </w:tr>
+    </w:tbl>
+    <w:p/>
+    <w:p>
+      <w:pPr>
+        <w:pStyle w:val="Heading3"/>
+      </w:pPr>
+      <w:r>
+        <w:t>Public/Mixed Endpoints - Internal (internal/index.php)</w:t>
+      </w:r>
+    </w:p>
+    <w:p/>
+    <w:tbl>
+      <w:tblPr>
+        <w:tblStyle w:val="TableGrid"/>
+        <w:tblW w:type="auto" w:w="0"/>
+        <w:tblLook w:firstColumn="1" w:firstRow="1" w:lastColumn="0" w:lastRow="0" w:noHBand="0" w:noVBand="1" w:val="04A0"/>
+      </w:tblPr>
+      <w:tblGrid>
+        <w:gridCol w:w="2880"/>
+        <w:gridCol w:w="2880"/>
+        <w:gridCol w:w="2880"/>
+      </w:tblGrid>
+      <w:tr>
+        <w:tc>
+          <w:tcPr>
+            <w:tcW w:type="dxa" w:w="2880"/>
+          </w:tcPr>
+          <w:p>
+            <w:r>
+              <w:t>Method</w:t>
+            </w:r>
+          </w:p>
+        </w:tc>
+        <w:tc>
+          <w:tcPr>
+            <w:tcW w:type="dxa" w:w="2880"/>
+          </w:tcPr>
+          <w:p>
+            <w:r>
+              <w:t>Path</w:t>
+            </w:r>
+          </w:p>
+        </w:tc>
+        <w:tc>
+          <w:tcPr>
+            <w:tcW w:type="dxa" w:w="2880"/>
+          </w:tcPr>
+          <w:p>
+            <w:r>
+              <w:t>Description</w:t>
             </w:r>
           </w:p>
         </w:tc>
@@ -3846,17 +4198,17 @@
           </w:tcPr>
           <w:p>
             <w:r>
-              <w:t>/api/categories/{id}</w:t>
-            </w:r>
-          </w:p>
-        </w:tc>
-        <w:tc>
-          <w:tcPr>
-            <w:tcW w:type="dxa" w:w="2880"/>
-          </w:tcPr>
-          <w:p>
-            <w:r>
-              <w:t>Get a single category</w:t>
+              <w:t>/</w:t>
+            </w:r>
+          </w:p>
+        </w:tc>
+        <w:tc>
+          <w:tcPr>
+            <w:tcW w:type="dxa" w:w="2880"/>
+          </w:tcPr>
+          <w:p>
+            <w:r>
+              <w:t>Internal landing routed to HR shell</w:t>
             </w:r>
           </w:p>
         </w:tc>
@@ -3878,17 +4230,17 @@
           </w:tcPr>
           <w:p>
             <w:r>
-              <w:t>/api/statuses</w:t>
-            </w:r>
-          </w:p>
-        </w:tc>
-        <w:tc>
-          <w:tcPr>
-            <w:tcW w:type="dxa" w:w="2880"/>
-          </w:tcPr>
-          <w:p>
-            <w:r>
-              <w:t>List active statuses</w:t>
+              <w:t>/api/reports</w:t>
+            </w:r>
+          </w:p>
+        </w:tc>
+        <w:tc>
+          <w:tcPr>
+            <w:tcW w:type="dxa" w:w="2880"/>
+          </w:tcPr>
+          <w:p>
+            <w:r>
+              <w:t>Public anonymized reports (intranet/domain/VPN gated)</w:t>
             </w:r>
           </w:p>
         </w:tc>
@@ -3910,17 +4262,17 @@
           </w:tcPr>
           <w:p>
             <w:r>
-              <w:t>/api/statuses/{id}</w:t>
-            </w:r>
-          </w:p>
-        </w:tc>
-        <w:tc>
-          <w:tcPr>
-            <w:tcW w:type="dxa" w:w="2880"/>
-          </w:tcPr>
-          <w:p>
-            <w:r>
-              <w:t>Get a single status</w:t>
+              <w:t>/api/attachments/{id}</w:t>
+            </w:r>
+          </w:p>
+        </w:tc>
+        <w:tc>
+          <w:tcPr>
+            <w:tcW w:type="dxa" w:w="2880"/>
+          </w:tcPr>
+          <w:p>
+            <w:r>
+              <w:t>Download attachment by ID</w:t>
             </w:r>
           </w:p>
         </w:tc>
@@ -3942,17 +4294,17 @@
           </w:tcPr>
           <w:p>
             <w:r>
-              <w:t>/api/stages</w:t>
-            </w:r>
-          </w:p>
-        </w:tc>
-        <w:tc>
-          <w:tcPr>
-            <w:tcW w:type="dxa" w:w="2880"/>
-          </w:tcPr>
-          <w:p>
-            <w:r>
-              <w:t>List active workflow stages</w:t>
+              <w:t>/api/categories</w:t>
+            </w:r>
+          </w:p>
+        </w:tc>
+        <w:tc>
+          <w:tcPr>
+            <w:tcW w:type="dxa" w:w="2880"/>
+          </w:tcPr>
+          <w:p>
+            <w:r>
+              <w:t>List active categories</w:t>
             </w:r>
           </w:p>
         </w:tc>
@@ -3974,17 +4326,81 @@
           </w:tcPr>
           <w:p>
             <w:r>
-              <w:t>/api/stages/{id}</w:t>
-            </w:r>
-          </w:p>
-        </w:tc>
-        <w:tc>
-          <w:tcPr>
-            <w:tcW w:type="dxa" w:w="2880"/>
-          </w:tcPr>
-          <w:p>
-            <w:r>
-              <w:t>Get a single stage</w:t>
+              <w:t>/api/statuses</w:t>
+            </w:r>
+          </w:p>
+        </w:tc>
+        <w:tc>
+          <w:tcPr>
+            <w:tcW w:type="dxa" w:w="2880"/>
+          </w:tcPr>
+          <w:p>
+            <w:r>
+              <w:t>List active statuses</w:t>
+            </w:r>
+          </w:p>
+        </w:tc>
+      </w:tr>
+      <w:tr>
+        <w:tc>
+          <w:tcPr>
+            <w:tcW w:type="dxa" w:w="2880"/>
+          </w:tcPr>
+          <w:p>
+            <w:r>
+              <w:t>GET</w:t>
+            </w:r>
+          </w:p>
+        </w:tc>
+        <w:tc>
+          <w:tcPr>
+            <w:tcW w:type="dxa" w:w="2880"/>
+          </w:tcPr>
+          <w:p>
+            <w:r>
+              <w:t>/api/stages</w:t>
+            </w:r>
+          </w:p>
+        </w:tc>
+        <w:tc>
+          <w:tcPr>
+            <w:tcW w:type="dxa" w:w="2880"/>
+          </w:tcPr>
+          <w:p>
+            <w:r>
+              <w:t>List active stages</w:t>
+            </w:r>
+          </w:p>
+        </w:tc>
+      </w:tr>
+      <w:tr>
+        <w:tc>
+          <w:tcPr>
+            <w:tcW w:type="dxa" w:w="2880"/>
+          </w:tcPr>
+          <w:p>
+            <w:r>
+              <w:t>GET</w:t>
+            </w:r>
+          </w:p>
+        </w:tc>
+        <w:tc>
+          <w:tcPr>
+            <w:tcW w:type="dxa" w:w="2880"/>
+          </w:tcPr>
+          <w:p>
+            <w:r>
+              <w:t>/anonymized/reports</w:t>
+            </w:r>
+          </w:p>
+        </w:tc>
+        <w:tc>
+          <w:tcPr>
+            <w:tcW w:type="dxa" w:w="2880"/>
+          </w:tcPr>
+          <w:p>
+            <w:r>
+              <w:t>Reports page (intranet/domain/VPN gated)</w:t>
             </w:r>
           </w:p>
         </w:tc>
@@ -4210,27 +4626,27 @@
           </w:tcPr>
           <w:p>
             <w:r>
-              <w:t>POST</w:t>
-            </w:r>
-          </w:p>
-        </w:tc>
-        <w:tc>
-          <w:tcPr>
-            <w:tcW w:type="dxa" w:w="2880"/>
-          </w:tcPr>
-          <w:p>
-            <w:r>
-              <w:t>/api/hr/login</w:t>
-            </w:r>
-          </w:p>
-        </w:tc>
-        <w:tc>
-          <w:tcPr>
-            <w:tcW w:type="dxa" w:w="2880"/>
-          </w:tcPr>
-          <w:p>
-            <w:r>
-              <w:t>Authenticate HR user, returns JWT</w:t>
+              <w:t>GET</w:t>
+            </w:r>
+          </w:p>
+        </w:tc>
+        <w:tc>
+          <w:tcPr>
+            <w:tcW w:type="dxa" w:w="2880"/>
+          </w:tcPr>
+          <w:p>
+            <w:r>
+              <w:t>/hr/stages</w:t>
+            </w:r>
+          </w:p>
+        </w:tc>
+        <w:tc>
+          <w:tcPr>
+            <w:tcW w:type="dxa" w:w="2880"/>
+          </w:tcPr>
+          <w:p>
+            <w:r>
+              <w:t>Manage stages (HTML)</w:t>
             </w:r>
           </w:p>
         </w:tc>
@@ -4252,17 +4668,17 @@
           </w:tcPr>
           <w:p>
             <w:r>
-              <w:t>/api/hr/logout</w:t>
-            </w:r>
-          </w:p>
-        </w:tc>
-        <w:tc>
-          <w:tcPr>
-            <w:tcW w:type="dxa" w:w="2880"/>
-          </w:tcPr>
-          <w:p>
-            <w:r>
-              <w:t>Invalidate session</w:t>
+              <w:t>/api/hr/login</w:t>
+            </w:r>
+          </w:p>
+        </w:tc>
+        <w:tc>
+          <w:tcPr>
+            <w:tcW w:type="dxa" w:w="2880"/>
+          </w:tcPr>
+          <w:p>
+            <w:r>
+              <w:t>Authenticate HR user, returns JWT</w:t>
             </w:r>
           </w:p>
         </w:tc>
@@ -4274,27 +4690,27 @@
           </w:tcPr>
           <w:p>
             <w:r>
-              <w:t>GET</w:t>
-            </w:r>
-          </w:p>
-        </w:tc>
-        <w:tc>
-          <w:tcPr>
-            <w:tcW w:type="dxa" w:w="2880"/>
-          </w:tcPr>
-          <w:p>
-            <w:r>
-              <w:t>/api/hr/me</w:t>
-            </w:r>
-          </w:p>
-        </w:tc>
-        <w:tc>
-          <w:tcPr>
-            <w:tcW w:type="dxa" w:w="2880"/>
-          </w:tcPr>
-          <w:p>
-            <w:r>
-              <w:t>Current authenticated user profile</w:t>
+              <w:t>POST</w:t>
+            </w:r>
+          </w:p>
+        </w:tc>
+        <w:tc>
+          <w:tcPr>
+            <w:tcW w:type="dxa" w:w="2880"/>
+          </w:tcPr>
+          <w:p>
+            <w:r>
+              <w:t>/api/hr/logout</w:t>
+            </w:r>
+          </w:p>
+        </w:tc>
+        <w:tc>
+          <w:tcPr>
+            <w:tcW w:type="dxa" w:w="2880"/>
+          </w:tcPr>
+          <w:p>
+            <w:r>
+              <w:t>Invalidate session</w:t>
             </w:r>
           </w:p>
         </w:tc>
@@ -4316,17 +4732,17 @@
           </w:tcPr>
           <w:p>
             <w:r>
-              <w:t>/api/hr/cases</w:t>
-            </w:r>
-          </w:p>
-        </w:tc>
-        <w:tc>
-          <w:tcPr>
-            <w:tcW w:type="dxa" w:w="2880"/>
-          </w:tcPr>
-          <w:p>
-            <w:r>
-              <w:t>List all feedback cases (filterable, paged)</w:t>
+              <w:t>/api/hr/me</w:t>
+            </w:r>
+          </w:p>
+        </w:tc>
+        <w:tc>
+          <w:tcPr>
+            <w:tcW w:type="dxa" w:w="2880"/>
+          </w:tcPr>
+          <w:p>
+            <w:r>
+              <w:t>Current authenticated user profile</w:t>
             </w:r>
           </w:p>
         </w:tc>
@@ -4348,17 +4764,17 @@
           </w:tcPr>
           <w:p>
             <w:r>
-              <w:t>/api/hr/cases/{reference}</w:t>
-            </w:r>
-          </w:p>
-        </w:tc>
-        <w:tc>
-          <w:tcPr>
-            <w:tcW w:type="dxa" w:w="2880"/>
-          </w:tcPr>
-          <w:p>
-            <w:r>
-              <w:t>Full case detail</w:t>
+              <w:t>/api/hr/cases</w:t>
+            </w:r>
+          </w:p>
+        </w:tc>
+        <w:tc>
+          <w:tcPr>
+            <w:tcW w:type="dxa" w:w="2880"/>
+          </w:tcPr>
+          <w:p>
+            <w:r>
+              <w:t>List all feedback cases (filterable, paged)</w:t>
             </w:r>
           </w:p>
         </w:tc>
@@ -4370,7 +4786,7 @@
           </w:tcPr>
           <w:p>
             <w:r>
-              <w:t>POST</w:t>
+              <w:t>GET</w:t>
             </w:r>
           </w:p>
         </w:tc>
@@ -4390,7 +4806,7 @@
           </w:tcPr>
           <w:p>
             <w:r>
-              <w:t>Update case (status, priority, notes, etc.)</w:t>
+              <w:t>Full case detail</w:t>
             </w:r>
           </w:p>
         </w:tc>
@@ -4402,27 +4818,27 @@
           </w:tcPr>
           <w:p>
             <w:r>
-              <w:t>GET</w:t>
-            </w:r>
-          </w:p>
-        </w:tc>
-        <w:tc>
-          <w:tcPr>
-            <w:tcW w:type="dxa" w:w="2880"/>
-          </w:tcPr>
-          <w:p>
-            <w:r>
-              <w:t>/api/hr/dashboard/trends</w:t>
-            </w:r>
-          </w:p>
-        </w:tc>
-        <w:tc>
-          <w:tcPr>
-            <w:tcW w:type="dxa" w:w="2880"/>
-          </w:tcPr>
-          <w:p>
-            <w:r>
-              <w:t>Quarterly category trends + frequency summary</w:t>
+              <w:t>POST</w:t>
+            </w:r>
+          </w:p>
+        </w:tc>
+        <w:tc>
+          <w:tcPr>
+            <w:tcW w:type="dxa" w:w="2880"/>
+          </w:tcPr>
+          <w:p>
+            <w:r>
+              <w:t>/api/hr/cases/{reference}</w:t>
+            </w:r>
+          </w:p>
+        </w:tc>
+        <w:tc>
+          <w:tcPr>
+            <w:tcW w:type="dxa" w:w="2880"/>
+          </w:tcPr>
+          <w:p>
+            <w:r>
+              <w:t>Update case (status, priority, notes, etc.)</w:t>
             </w:r>
           </w:p>
         </w:tc>
@@ -4434,27 +4850,27 @@
           </w:tcPr>
           <w:p>
             <w:r>
-              <w:t>GET/POST/PUT/DELETE</w:t>
-            </w:r>
-          </w:p>
-        </w:tc>
-        <w:tc>
-          <w:tcPr>
-            <w:tcW w:type="dxa" w:w="2880"/>
-          </w:tcPr>
-          <w:p>
-            <w:r>
-              <w:t>/api/hr/categories</w:t>
-            </w:r>
-          </w:p>
-        </w:tc>
-        <w:tc>
-          <w:tcPr>
-            <w:tcW w:type="dxa" w:w="2880"/>
-          </w:tcPr>
-          <w:p>
-            <w:r>
-              <w:t>CRUD for feedback categories</w:t>
+              <w:t>GET</w:t>
+            </w:r>
+          </w:p>
+        </w:tc>
+        <w:tc>
+          <w:tcPr>
+            <w:tcW w:type="dxa" w:w="2880"/>
+          </w:tcPr>
+          <w:p>
+            <w:r>
+              <w:t>/api/hr/personnel</w:t>
+            </w:r>
+          </w:p>
+        </w:tc>
+        <w:tc>
+          <w:tcPr>
+            <w:tcW w:type="dxa" w:w="2880"/>
+          </w:tcPr>
+          <w:p>
+            <w:r>
+              <w:t>List assignable HR/Ethics personnel</w:t>
             </w:r>
           </w:p>
         </w:tc>
@@ -4466,27 +4882,27 @@
           </w:tcPr>
           <w:p>
             <w:r>
-              <w:t>GET/POST/PUT/DELETE</w:t>
-            </w:r>
-          </w:p>
-        </w:tc>
-        <w:tc>
-          <w:tcPr>
-            <w:tcW w:type="dxa" w:w="2880"/>
-          </w:tcPr>
-          <w:p>
-            <w:r>
-              <w:t>/api/hr/statuses</w:t>
-            </w:r>
-          </w:p>
-        </w:tc>
-        <w:tc>
-          <w:tcPr>
-            <w:tcW w:type="dxa" w:w="2880"/>
-          </w:tcPr>
-          <w:p>
-            <w:r>
-              <w:t>CRUD for workflow statuses</w:t>
+              <w:t>GET</w:t>
+            </w:r>
+          </w:p>
+        </w:tc>
+        <w:tc>
+          <w:tcPr>
+            <w:tcW w:type="dxa" w:w="2880"/>
+          </w:tcPr>
+          <w:p>
+            <w:r>
+              <w:t>/api/hr/dashboard/trends</w:t>
+            </w:r>
+          </w:p>
+        </w:tc>
+        <w:tc>
+          <w:tcPr>
+            <w:tcW w:type="dxa" w:w="2880"/>
+          </w:tcPr>
+          <w:p>
+            <w:r>
+              <w:t>Quarterly category trends + frequency summary</w:t>
             </w:r>
           </w:p>
         </w:tc>
@@ -4508,17 +4924,17 @@
           </w:tcPr>
           <w:p>
             <w:r>
-              <w:t>/api/hr/stages</w:t>
-            </w:r>
-          </w:p>
-        </w:tc>
-        <w:tc>
-          <w:tcPr>
-            <w:tcW w:type="dxa" w:w="2880"/>
-          </w:tcPr>
-          <w:p>
-            <w:r>
-              <w:t>CRUD for workflow stages</w:t>
+              <w:t>/api/hr/categories</w:t>
+            </w:r>
+          </w:p>
+        </w:tc>
+        <w:tc>
+          <w:tcPr>
+            <w:tcW w:type="dxa" w:w="2880"/>
+          </w:tcPr>
+          <w:p>
+            <w:r>
+              <w:t>CRUD for feedback categories</w:t>
             </w:r>
           </w:p>
         </w:tc>
@@ -4530,27 +4946,27 @@
           </w:tcPr>
           <w:p>
             <w:r>
-              <w:t>GET</w:t>
-            </w:r>
-          </w:p>
-        </w:tc>
-        <w:tc>
-          <w:tcPr>
-            <w:tcW w:type="dxa" w:w="2880"/>
-          </w:tcPr>
-          <w:p>
-            <w:r>
-              <w:t>/api/docs</w:t>
-            </w:r>
-          </w:p>
-        </w:tc>
-        <w:tc>
-          <w:tcPr>
-            <w:tcW w:type="dxa" w:w="2880"/>
-          </w:tcPr>
-          <w:p>
-            <w:r>
-              <w:t>API documentation page (HTML)</w:t>
+              <w:t>GET/POST/PUT/DELETE</w:t>
+            </w:r>
+          </w:p>
+        </w:tc>
+        <w:tc>
+          <w:tcPr>
+            <w:tcW w:type="dxa" w:w="2880"/>
+          </w:tcPr>
+          <w:p>
+            <w:r>
+              <w:t>/api/hr/statuses</w:t>
+            </w:r>
+          </w:p>
+        </w:tc>
+        <w:tc>
+          <w:tcPr>
+            <w:tcW w:type="dxa" w:w="2880"/>
+          </w:tcPr>
+          <w:p>
+            <w:r>
+              <w:t>CRUD for workflow statuses</w:t>
             </w:r>
           </w:p>
         </w:tc>
@@ -4562,27 +4978,27 @@
           </w:tcPr>
           <w:p>
             <w:r>
-              <w:t>GET</w:t>
-            </w:r>
-          </w:p>
-        </w:tc>
-        <w:tc>
-          <w:tcPr>
-            <w:tcW w:type="dxa" w:w="2880"/>
-          </w:tcPr>
-          <w:p>
-            <w:r>
-              <w:t>/api/openapi.json</w:t>
-            </w:r>
-          </w:p>
-        </w:tc>
-        <w:tc>
-          <w:tcPr>
-            <w:tcW w:type="dxa" w:w="2880"/>
-          </w:tcPr>
-          <w:p>
-            <w:r>
-              <w:t>OpenAPI 3.0 specification (JSON)</w:t>
+              <w:t>GET/POST/PUT/DELETE</w:t>
+            </w:r>
+          </w:p>
+        </w:tc>
+        <w:tc>
+          <w:tcPr>
+            <w:tcW w:type="dxa" w:w="2880"/>
+          </w:tcPr>
+          <w:p>
+            <w:r>
+              <w:t>/api/hr/stages</w:t>
+            </w:r>
+          </w:p>
+        </w:tc>
+        <w:tc>
+          <w:tcPr>
+            <w:tcW w:type="dxa" w:w="2880"/>
+          </w:tcPr>
+          <w:p>
+            <w:r>
+              <w:t>CRUD for workflow stages</w:t>
             </w:r>
           </w:p>
         </w:tc>
@@ -4624,7 +5040,7 @@
         <w:br/>
         <w:t xml:space="preserve">  C --&gt;|local| E[Local users table authentication only]</w:t>
         <w:br/>
-        <w:t xml:space="preserve">  C --&gt;|hybrid| F[Try LDAP then fallback to local database]</w:t>
+        <w:t xml:space="preserve">  C --&gt;|hybrid| F[Try local database then fallback to LDAP]</w:t>
         <w:br/>
         <w:t xml:space="preserve">  D --&gt; G{Authenticated?}</w:t>
         <w:br/>
@@ -4755,7 +5171,7 @@
         <w:pStyle w:val="ListBullet"/>
       </w:pPr>
       <w:r>
-        <w:t>No session, cookie, IP address, user agent, or browser fingerprint is stored against a submission</w:t>
+        <w:t>No direct user identity is stored against anonymous submissions in feedbacks</w:t>
       </w:r>
     </w:p>
     <w:p>
@@ -4830,7 +5246,7 @@
         <w:pStyle w:val="ListBullet"/>
       </w:pPr>
       <w:r>
-        <w:t>Files are stored in the /uploads/ directory using a randomised stored_name</w:t>
+        <w:t>Files are stored in a private attachments storage path (default: anonymous_feedback_private_uploads/) using a randomised stored_name</w:t>
       </w:r>
     </w:p>
     <w:p>
@@ -5235,7 +5651,7 @@
           </w:tcPr>
           <w:p>
             <w:r>
-              <w:t>Not applicable — all state-changing operations require JWT authentication</w:t>
+              <w:t>Public anonymous endpoints exist; HR state-changing operations require JWT</w:t>
             </w:r>
           </w:p>
         </w:tc>
@@ -5558,27 +5974,27 @@
           </w:tcPr>
           <w:p>
             <w:r>
-              <w:t>JWT_SECRET</w:t>
-            </w:r>
-          </w:p>
-        </w:tc>
-        <w:tc>
-          <w:tcPr>
-            <w:tcW w:type="dxa" w:w="2880"/>
-          </w:tcPr>
-          <w:p>
-            <w:r>
-              <w:t>HMAC signing key — must be changed in production</w:t>
-            </w:r>
-          </w:p>
-        </w:tc>
-        <w:tc>
-          <w:tcPr>
-            <w:tcW w:type="dxa" w:w="2880"/>
-          </w:tcPr>
-          <w:p>
-            <w:r>
-              <w:t>insecure default</w:t>
+              <w:t>ATTACHMENTS_STORAGE_PATH</w:t>
+            </w:r>
+          </w:p>
+        </w:tc>
+        <w:tc>
+          <w:tcPr>
+            <w:tcW w:type="dxa" w:w="2880"/>
+          </w:tcPr>
+          <w:p>
+            <w:r>
+              <w:t>Absolute/relative private attachments directory</w:t>
+            </w:r>
+          </w:p>
+        </w:tc>
+        <w:tc>
+          <w:tcPr>
+            <w:tcW w:type="dxa" w:w="2880"/>
+          </w:tcPr>
+          <w:p>
+            <w:r>
+              <w:t>repo anonymous_feedback_private_uploads</w:t>
             </w:r>
           </w:p>
         </w:tc>
@@ -5590,27 +6006,27 @@
           </w:tcPr>
           <w:p>
             <w:r>
-              <w:t>DB_HOST</w:t>
-            </w:r>
-          </w:p>
-        </w:tc>
-        <w:tc>
-          <w:tcPr>
-            <w:tcW w:type="dxa" w:w="2880"/>
-          </w:tcPr>
-          <w:p>
-            <w:r>
-              <w:t>MySQL host</w:t>
-            </w:r>
-          </w:p>
-        </w:tc>
-        <w:tc>
-          <w:tcPr>
-            <w:tcW w:type="dxa" w:w="2880"/>
-          </w:tcPr>
-          <w:p>
-            <w:r>
-              <w:t>127.0.0.1</w:t>
+              <w:t>JWT_SECRET</w:t>
+            </w:r>
+          </w:p>
+        </w:tc>
+        <w:tc>
+          <w:tcPr>
+            <w:tcW w:type="dxa" w:w="2880"/>
+          </w:tcPr>
+          <w:p>
+            <w:r>
+              <w:t>HMAC signing key — must be changed in production</w:t>
+            </w:r>
+          </w:p>
+        </w:tc>
+        <w:tc>
+          <w:tcPr>
+            <w:tcW w:type="dxa" w:w="2880"/>
+          </w:tcPr>
+          <w:p>
+            <w:r>
+              <w:t>insecure default</w:t>
             </w:r>
           </w:p>
         </w:tc>
@@ -5622,27 +6038,27 @@
           </w:tcPr>
           <w:p>
             <w:r>
-              <w:t>DB_PORT</w:t>
-            </w:r>
-          </w:p>
-        </w:tc>
-        <w:tc>
-          <w:tcPr>
-            <w:tcW w:type="dxa" w:w="2880"/>
-          </w:tcPr>
-          <w:p>
-            <w:r>
-              <w:t>MySQL port</w:t>
-            </w:r>
-          </w:p>
-        </w:tc>
-        <w:tc>
-          <w:tcPr>
-            <w:tcW w:type="dxa" w:w="2880"/>
-          </w:tcPr>
-          <w:p>
-            <w:r>
-              <w:t>3306</w:t>
+              <w:t>DB_HOST</w:t>
+            </w:r>
+          </w:p>
+        </w:tc>
+        <w:tc>
+          <w:tcPr>
+            <w:tcW w:type="dxa" w:w="2880"/>
+          </w:tcPr>
+          <w:p>
+            <w:r>
+              <w:t>MySQL host</w:t>
+            </w:r>
+          </w:p>
+        </w:tc>
+        <w:tc>
+          <w:tcPr>
+            <w:tcW w:type="dxa" w:w="2880"/>
+          </w:tcPr>
+          <w:p>
+            <w:r>
+              <w:t>127.0.0.1</w:t>
             </w:r>
           </w:p>
         </w:tc>
@@ -5654,27 +6070,27 @@
           </w:tcPr>
           <w:p>
             <w:r>
-              <w:t>DB_DATABASE</w:t>
-            </w:r>
-          </w:p>
-        </w:tc>
-        <w:tc>
-          <w:tcPr>
-            <w:tcW w:type="dxa" w:w="2880"/>
-          </w:tcPr>
-          <w:p>
-            <w:r>
-              <w:t>Database name</w:t>
-            </w:r>
-          </w:p>
-        </w:tc>
-        <w:tc>
-          <w:tcPr>
-            <w:tcW w:type="dxa" w:w="2880"/>
-          </w:tcPr>
-          <w:p>
-            <w:r>
-              <w:t>anonymous_feedback_tool</w:t>
+              <w:t>DB_PORT</w:t>
+            </w:r>
+          </w:p>
+        </w:tc>
+        <w:tc>
+          <w:tcPr>
+            <w:tcW w:type="dxa" w:w="2880"/>
+          </w:tcPr>
+          <w:p>
+            <w:r>
+              <w:t>MySQL port</w:t>
+            </w:r>
+          </w:p>
+        </w:tc>
+        <w:tc>
+          <w:tcPr>
+            <w:tcW w:type="dxa" w:w="2880"/>
+          </w:tcPr>
+          <w:p>
+            <w:r>
+              <w:t>3306</w:t>
             </w:r>
           </w:p>
         </w:tc>
@@ -5686,27 +6102,27 @@
           </w:tcPr>
           <w:p>
             <w:r>
-              <w:t>DB_USERNAME</w:t>
-            </w:r>
-          </w:p>
-        </w:tc>
-        <w:tc>
-          <w:tcPr>
-            <w:tcW w:type="dxa" w:w="2880"/>
-          </w:tcPr>
-          <w:p>
-            <w:r>
-              <w:t>Database user</w:t>
-            </w:r>
-          </w:p>
-        </w:tc>
-        <w:tc>
-          <w:tcPr>
-            <w:tcW w:type="dxa" w:w="2880"/>
-          </w:tcPr>
-          <w:p>
-            <w:r>
-              <w:t>_(empty)_</w:t>
+              <w:t>DB_DATABASE</w:t>
+            </w:r>
+          </w:p>
+        </w:tc>
+        <w:tc>
+          <w:tcPr>
+            <w:tcW w:type="dxa" w:w="2880"/>
+          </w:tcPr>
+          <w:p>
+            <w:r>
+              <w:t>Database name</w:t>
+            </w:r>
+          </w:p>
+        </w:tc>
+        <w:tc>
+          <w:tcPr>
+            <w:tcW w:type="dxa" w:w="2880"/>
+          </w:tcPr>
+          <w:p>
+            <w:r>
+              <w:t>anonymous_feedback_tool</w:t>
             </w:r>
           </w:p>
         </w:tc>
@@ -5718,17 +6134,17 @@
           </w:tcPr>
           <w:p>
             <w:r>
-              <w:t>DB_PASSWORD</w:t>
-            </w:r>
-          </w:p>
-        </w:tc>
-        <w:tc>
-          <w:tcPr>
-            <w:tcW w:type="dxa" w:w="2880"/>
-          </w:tcPr>
-          <w:p>
-            <w:r>
-              <w:t>Database password</w:t>
+              <w:t>DB_USERNAME</w:t>
+            </w:r>
+          </w:p>
+        </w:tc>
+        <w:tc>
+          <w:tcPr>
+            <w:tcW w:type="dxa" w:w="2880"/>
+          </w:tcPr>
+          <w:p>
+            <w:r>
+              <w:t>Database user</w:t>
             </w:r>
           </w:p>
         </w:tc>
@@ -5750,27 +6166,27 @@
           </w:tcPr>
           <w:p>
             <w:r>
-              <w:t>HR_AUTH_MODE</w:t>
-            </w:r>
-          </w:p>
-        </w:tc>
-        <w:tc>
-          <w:tcPr>
-            <w:tcW w:type="dxa" w:w="2880"/>
-          </w:tcPr>
-          <w:p>
-            <w:r>
-              <w:t>hybrid, ldap, or local</w:t>
-            </w:r>
-          </w:p>
-        </w:tc>
-        <w:tc>
-          <w:tcPr>
-            <w:tcW w:type="dxa" w:w="2880"/>
-          </w:tcPr>
-          <w:p>
-            <w:r>
-              <w:t>hybrid</w:t>
+              <w:t>DB_PASSWORD</w:t>
+            </w:r>
+          </w:p>
+        </w:tc>
+        <w:tc>
+          <w:tcPr>
+            <w:tcW w:type="dxa" w:w="2880"/>
+          </w:tcPr>
+          <w:p>
+            <w:r>
+              <w:t>Database password</w:t>
+            </w:r>
+          </w:p>
+        </w:tc>
+        <w:tc>
+          <w:tcPr>
+            <w:tcW w:type="dxa" w:w="2880"/>
+          </w:tcPr>
+          <w:p>
+            <w:r>
+              <w:t>_(empty)_</w:t>
             </w:r>
           </w:p>
         </w:tc>
@@ -5782,27 +6198,27 @@
           </w:tcPr>
           <w:p>
             <w:r>
-              <w:t>LDAP_HOST</w:t>
-            </w:r>
-          </w:p>
-        </w:tc>
-        <w:tc>
-          <w:tcPr>
-            <w:tcW w:type="dxa" w:w="2880"/>
-          </w:tcPr>
-          <w:p>
-            <w:r>
-              <w:t>Active Directory / LDAP server</w:t>
-            </w:r>
-          </w:p>
-        </w:tc>
-        <w:tc>
-          <w:tcPr>
-            <w:tcW w:type="dxa" w:w="2880"/>
-          </w:tcPr>
-          <w:p>
-            <w:r>
-              <w:t>localhost</w:t>
+              <w:t>HR_AUTH_MODE</w:t>
+            </w:r>
+          </w:p>
+        </w:tc>
+        <w:tc>
+          <w:tcPr>
+            <w:tcW w:type="dxa" w:w="2880"/>
+          </w:tcPr>
+          <w:p>
+            <w:r>
+              <w:t>hybrid, ldap, or local</w:t>
+            </w:r>
+          </w:p>
+        </w:tc>
+        <w:tc>
+          <w:tcPr>
+            <w:tcW w:type="dxa" w:w="2880"/>
+          </w:tcPr>
+          <w:p>
+            <w:r>
+              <w:t>hybrid</w:t>
             </w:r>
           </w:p>
         </w:tc>
@@ -5814,27 +6230,27 @@
           </w:tcPr>
           <w:p>
             <w:r>
-              <w:t>LDAP_PORT</w:t>
-            </w:r>
-          </w:p>
-        </w:tc>
-        <w:tc>
-          <w:tcPr>
-            <w:tcW w:type="dxa" w:w="2880"/>
-          </w:tcPr>
-          <w:p>
-            <w:r>
-              <w:t>LDAP port</w:t>
-            </w:r>
-          </w:p>
-        </w:tc>
-        <w:tc>
-          <w:tcPr>
-            <w:tcW w:type="dxa" w:w="2880"/>
-          </w:tcPr>
-          <w:p>
-            <w:r>
-              <w:t>389</w:t>
+              <w:t>LDAP_HOST</w:t>
+            </w:r>
+          </w:p>
+        </w:tc>
+        <w:tc>
+          <w:tcPr>
+            <w:tcW w:type="dxa" w:w="2880"/>
+          </w:tcPr>
+          <w:p>
+            <w:r>
+              <w:t>Active Directory / LDAP server</w:t>
+            </w:r>
+          </w:p>
+        </w:tc>
+        <w:tc>
+          <w:tcPr>
+            <w:tcW w:type="dxa" w:w="2880"/>
+          </w:tcPr>
+          <w:p>
+            <w:r>
+              <w:t>localhost</w:t>
             </w:r>
           </w:p>
         </w:tc>
@@ -5846,27 +6262,27 @@
           </w:tcPr>
           <w:p>
             <w:r>
-              <w:t>LDAP_BASE_DN</w:t>
-            </w:r>
-          </w:p>
-        </w:tc>
-        <w:tc>
-          <w:tcPr>
-            <w:tcW w:type="dxa" w:w="2880"/>
-          </w:tcPr>
-          <w:p>
-            <w:r>
-              <w:t>Base DN for user searches</w:t>
-            </w:r>
-          </w:p>
-        </w:tc>
-        <w:tc>
-          <w:tcPr>
-            <w:tcW w:type="dxa" w:w="2880"/>
-          </w:tcPr>
-          <w:p>
-            <w:r>
-              <w:t>_(empty)_</w:t>
+              <w:t>LDAP_PORT</w:t>
+            </w:r>
+          </w:p>
+        </w:tc>
+        <w:tc>
+          <w:tcPr>
+            <w:tcW w:type="dxa" w:w="2880"/>
+          </w:tcPr>
+          <w:p>
+            <w:r>
+              <w:t>LDAP port</w:t>
+            </w:r>
+          </w:p>
+        </w:tc>
+        <w:tc>
+          <w:tcPr>
+            <w:tcW w:type="dxa" w:w="2880"/>
+          </w:tcPr>
+          <w:p>
+            <w:r>
+              <w:t>389</w:t>
             </w:r>
           </w:p>
         </w:tc>
@@ -5878,17 +6294,17 @@
           </w:tcPr>
           <w:p>
             <w:r>
-              <w:t>LDAP_DOMAIN</w:t>
-            </w:r>
-          </w:p>
-        </w:tc>
-        <w:tc>
-          <w:tcPr>
-            <w:tcW w:type="dxa" w:w="2880"/>
-          </w:tcPr>
-          <w:p>
-            <w:r>
-              <w:t>AD domain for UPN suffix</w:t>
+              <w:t>LDAP_BASE_DN</w:t>
+            </w:r>
+          </w:p>
+        </w:tc>
+        <w:tc>
+          <w:tcPr>
+            <w:tcW w:type="dxa" w:w="2880"/>
+          </w:tcPr>
+          <w:p>
+            <w:r>
+              <w:t>Base DN for user searches</w:t>
             </w:r>
           </w:p>
         </w:tc>
@@ -5910,27 +6326,27 @@
           </w:tcPr>
           <w:p>
             <w:r>
-              <w:t>LDAP_USE_TLS</w:t>
-            </w:r>
-          </w:p>
-        </w:tc>
-        <w:tc>
-          <w:tcPr>
-            <w:tcW w:type="dxa" w:w="2880"/>
-          </w:tcPr>
-          <w:p>
-            <w:r>
-              <w:t>Enable STARTTLS</w:t>
-            </w:r>
-          </w:p>
-        </w:tc>
-        <w:tc>
-          <w:tcPr>
-            <w:tcW w:type="dxa" w:w="2880"/>
-          </w:tcPr>
-          <w:p>
-            <w:r>
-              <w:t>false</w:t>
+              <w:t>LDAP_DOMAIN</w:t>
+            </w:r>
+          </w:p>
+        </w:tc>
+        <w:tc>
+          <w:tcPr>
+            <w:tcW w:type="dxa" w:w="2880"/>
+          </w:tcPr>
+          <w:p>
+            <w:r>
+              <w:t>AD domain for UPN suffix</w:t>
+            </w:r>
+          </w:p>
+        </w:tc>
+        <w:tc>
+          <w:tcPr>
+            <w:tcW w:type="dxa" w:w="2880"/>
+          </w:tcPr>
+          <w:p>
+            <w:r>
+              <w:t>_(empty)_</w:t>
             </w:r>
           </w:p>
         </w:tc>
@@ -5942,27 +6358,27 @@
           </w:tcPr>
           <w:p>
             <w:r>
-              <w:t>LDAP_SERVICE_USER</w:t>
-            </w:r>
-          </w:p>
-        </w:tc>
-        <w:tc>
-          <w:tcPr>
-            <w:tcW w:type="dxa" w:w="2880"/>
-          </w:tcPr>
-          <w:p>
-            <w:r>
-              <w:t>Service account DN for bind</w:t>
-            </w:r>
-          </w:p>
-        </w:tc>
-        <w:tc>
-          <w:tcPr>
-            <w:tcW w:type="dxa" w:w="2880"/>
-          </w:tcPr>
-          <w:p>
-            <w:r>
-              <w:t>_(empty)_</w:t>
+              <w:t>LDAP_BIND_PATTERN</w:t>
+            </w:r>
+          </w:p>
+        </w:tc>
+        <w:tc>
+          <w:tcPr>
+            <w:tcW w:type="dxa" w:w="2880"/>
+          </w:tcPr>
+          <w:p>
+            <w:r>
+              <w:t>Direct-bind pattern (e.g. %s@domain.com)</w:t>
+            </w:r>
+          </w:p>
+        </w:tc>
+        <w:tc>
+          <w:tcPr>
+            <w:tcW w:type="dxa" w:w="2880"/>
+          </w:tcPr>
+          <w:p>
+            <w:r>
+              <w:t>%s</w:t>
             </w:r>
           </w:p>
         </w:tc>
@@ -5974,27 +6390,27 @@
           </w:tcPr>
           <w:p>
             <w:r>
-              <w:t>LDAP_SERVICE_PASSWORD</w:t>
-            </w:r>
-          </w:p>
-        </w:tc>
-        <w:tc>
-          <w:tcPr>
-            <w:tcW w:type="dxa" w:w="2880"/>
-          </w:tcPr>
-          <w:p>
-            <w:r>
-              <w:t>Service account password</w:t>
-            </w:r>
-          </w:p>
-        </w:tc>
-        <w:tc>
-          <w:tcPr>
-            <w:tcW w:type="dxa" w:w="2880"/>
-          </w:tcPr>
-          <w:p>
-            <w:r>
-              <w:t>_(empty)_</w:t>
+              <w:t>LDAP_USE_TLS</w:t>
+            </w:r>
+          </w:p>
+        </w:tc>
+        <w:tc>
+          <w:tcPr>
+            <w:tcW w:type="dxa" w:w="2880"/>
+          </w:tcPr>
+          <w:p>
+            <w:r>
+              <w:t>Enable STARTTLS</w:t>
+            </w:r>
+          </w:p>
+        </w:tc>
+        <w:tc>
+          <w:tcPr>
+            <w:tcW w:type="dxa" w:w="2880"/>
+          </w:tcPr>
+          <w:p>
+            <w:r>
+              <w:t>false</w:t>
             </w:r>
           </w:p>
         </w:tc>
@@ -6006,17 +6422,17 @@
           </w:tcPr>
           <w:p>
             <w:r>
-              <w:t>LDAP_HR_GROUPS</w:t>
-            </w:r>
-          </w:p>
-        </w:tc>
-        <w:tc>
-          <w:tcPr>
-            <w:tcW w:type="dxa" w:w="2880"/>
-          </w:tcPr>
-          <w:p>
-            <w:r>
-              <w:t>Comma-separated AD groups for HR role</w:t>
+              <w:t>LDAP_SERVICE_USER</w:t>
+            </w:r>
+          </w:p>
+        </w:tc>
+        <w:tc>
+          <w:tcPr>
+            <w:tcW w:type="dxa" w:w="2880"/>
+          </w:tcPr>
+          <w:p>
+            <w:r>
+              <w:t>Service account DN for bind</w:t>
             </w:r>
           </w:p>
         </w:tc>
@@ -6038,17 +6454,17 @@
           </w:tcPr>
           <w:p>
             <w:r>
-              <w:t>LDAP_IS_GROUPS</w:t>
-            </w:r>
-          </w:p>
-        </w:tc>
-        <w:tc>
-          <w:tcPr>
-            <w:tcW w:type="dxa" w:w="2880"/>
-          </w:tcPr>
-          <w:p>
-            <w:r>
-              <w:t>Comma-separated AD groups for Ethics role</w:t>
+              <w:t>LDAP_SERVICE_PASSWORD</w:t>
+            </w:r>
+          </w:p>
+        </w:tc>
+        <w:tc>
+          <w:tcPr>
+            <w:tcW w:type="dxa" w:w="2880"/>
+          </w:tcPr>
+          <w:p>
+            <w:r>
+              <w:t>Service account password</w:t>
             </w:r>
           </w:p>
         </w:tc>
@@ -6070,27 +6486,27 @@
           </w:tcPr>
           <w:p>
             <w:r>
-              <w:t>SMTP_HOST</w:t>
-            </w:r>
-          </w:p>
-        </w:tc>
-        <w:tc>
-          <w:tcPr>
-            <w:tcW w:type="dxa" w:w="2880"/>
-          </w:tcPr>
-          <w:p>
-            <w:r>
-              <w:t>SMTP server hostname</w:t>
-            </w:r>
-          </w:p>
-        </w:tc>
-        <w:tc>
-          <w:tcPr>
-            <w:tcW w:type="dxa" w:w="2880"/>
-          </w:tcPr>
-          <w:p>
-            <w:r>
-              <w:t>localhost</w:t>
+              <w:t>LDAP_HR_GROUPS</w:t>
+            </w:r>
+          </w:p>
+        </w:tc>
+        <w:tc>
+          <w:tcPr>
+            <w:tcW w:type="dxa" w:w="2880"/>
+          </w:tcPr>
+          <w:p>
+            <w:r>
+              <w:t>Pipe-separated HR group DNs/CNs</w:t>
+            </w:r>
+          </w:p>
+        </w:tc>
+        <w:tc>
+          <w:tcPr>
+            <w:tcW w:type="dxa" w:w="2880"/>
+          </w:tcPr>
+          <w:p>
+            <w:r>
+              <w:t>_(empty)_</w:t>
             </w:r>
           </w:p>
         </w:tc>
@@ -6102,27 +6518,27 @@
           </w:tcPr>
           <w:p>
             <w:r>
-              <w:t>SMTP_PORT</w:t>
-            </w:r>
-          </w:p>
-        </w:tc>
-        <w:tc>
-          <w:tcPr>
-            <w:tcW w:type="dxa" w:w="2880"/>
-          </w:tcPr>
-          <w:p>
-            <w:r>
-              <w:t>SMTP port (587 = STARTTLS, 465 = SMTPS)</w:t>
-            </w:r>
-          </w:p>
-        </w:tc>
-        <w:tc>
-          <w:tcPr>
-            <w:tcW w:type="dxa" w:w="2880"/>
-          </w:tcPr>
-          <w:p>
-            <w:r>
-              <w:t>587</w:t>
+              <w:t>LDAP_IS_GROUPS</w:t>
+            </w:r>
+          </w:p>
+        </w:tc>
+        <w:tc>
+          <w:tcPr>
+            <w:tcW w:type="dxa" w:w="2880"/>
+          </w:tcPr>
+          <w:p>
+            <w:r>
+              <w:t>Pipe-separated Information Systems group DNs/CNs</w:t>
+            </w:r>
+          </w:p>
+        </w:tc>
+        <w:tc>
+          <w:tcPr>
+            <w:tcW w:type="dxa" w:w="2880"/>
+          </w:tcPr>
+          <w:p>
+            <w:r>
+              <w:t>_(empty)_</w:t>
             </w:r>
           </w:p>
         </w:tc>
@@ -6134,17 +6550,17 @@
           </w:tcPr>
           <w:p>
             <w:r>
-              <w:t>SMTP_USERNAME</w:t>
-            </w:r>
-          </w:p>
-        </w:tc>
-        <w:tc>
-          <w:tcPr>
-            <w:tcW w:type="dxa" w:w="2880"/>
-          </w:tcPr>
-          <w:p>
-            <w:r>
-              <w:t>SMTP auth username</w:t>
+              <w:t>LDAP_HR_OUS</w:t>
+            </w:r>
+          </w:p>
+        </w:tc>
+        <w:tc>
+          <w:tcPr>
+            <w:tcW w:type="dxa" w:w="2880"/>
+          </w:tcPr>
+          <w:p>
+            <w:r>
+              <w:t>Pipe-separated OU fragments for HR role mapping</w:t>
             </w:r>
           </w:p>
         </w:tc>
@@ -6166,17 +6582,17 @@
           </w:tcPr>
           <w:p>
             <w:r>
-              <w:t>SMTP_PASSWORD</w:t>
-            </w:r>
-          </w:p>
-        </w:tc>
-        <w:tc>
-          <w:tcPr>
-            <w:tcW w:type="dxa" w:w="2880"/>
-          </w:tcPr>
-          <w:p>
-            <w:r>
-              <w:t>SMTP auth password</w:t>
+              <w:t>LDAP_IS_OUS</w:t>
+            </w:r>
+          </w:p>
+        </w:tc>
+        <w:tc>
+          <w:tcPr>
+            <w:tcW w:type="dxa" w:w="2880"/>
+          </w:tcPr>
+          <w:p>
+            <w:r>
+              <w:t>Pipe-separated OU fragments for Information Systems role mapping</w:t>
             </w:r>
           </w:p>
         </w:tc>
@@ -6198,27 +6614,27 @@
           </w:tcPr>
           <w:p>
             <w:r>
-              <w:t>MAIL_FROM</w:t>
-            </w:r>
-          </w:p>
-        </w:tc>
-        <w:tc>
-          <w:tcPr>
-            <w:tcW w:type="dxa" w:w="2880"/>
-          </w:tcPr>
-          <w:p>
-            <w:r>
-              <w:t>Sender email address</w:t>
-            </w:r>
-          </w:p>
-        </w:tc>
-        <w:tc>
-          <w:tcPr>
-            <w:tcW w:type="dxa" w:w="2880"/>
-          </w:tcPr>
-          <w:p>
-            <w:r>
-              <w:t>noreply@localhost</w:t>
+              <w:t>LDAP_HR_DEPARTMENTS</w:t>
+            </w:r>
+          </w:p>
+        </w:tc>
+        <w:tc>
+          <w:tcPr>
+            <w:tcW w:type="dxa" w:w="2880"/>
+          </w:tcPr>
+          <w:p>
+            <w:r>
+              <w:t>Pipe-separated department names for HR role mapping</w:t>
+            </w:r>
+          </w:p>
+        </w:tc>
+        <w:tc>
+          <w:tcPr>
+            <w:tcW w:type="dxa" w:w="2880"/>
+          </w:tcPr>
+          <w:p>
+            <w:r>
+              <w:t>_(empty)_</w:t>
             </w:r>
           </w:p>
         </w:tc>
@@ -6230,27 +6646,27 @@
           </w:tcPr>
           <w:p>
             <w:r>
-              <w:t>MAIL_FROM_NAME</w:t>
-            </w:r>
-          </w:p>
-        </w:tc>
-        <w:tc>
-          <w:tcPr>
-            <w:tcW w:type="dxa" w:w="2880"/>
-          </w:tcPr>
-          <w:p>
-            <w:r>
-              <w:t>Sender display name</w:t>
-            </w:r>
-          </w:p>
-        </w:tc>
-        <w:tc>
-          <w:tcPr>
-            <w:tcW w:type="dxa" w:w="2880"/>
-          </w:tcPr>
-          <w:p>
-            <w:r>
-              <w:t>Voice Without Fear</w:t>
+              <w:t>LDAP_IS_DEPARTMENTS</w:t>
+            </w:r>
+          </w:p>
+        </w:tc>
+        <w:tc>
+          <w:tcPr>
+            <w:tcW w:type="dxa" w:w="2880"/>
+          </w:tcPr>
+          <w:p>
+            <w:r>
+              <w:t>Pipe-separated department names for Information Systems role mapping</w:t>
+            </w:r>
+          </w:p>
+        </w:tc>
+        <w:tc>
+          <w:tcPr>
+            <w:tcW w:type="dxa" w:w="2880"/>
+          </w:tcPr>
+          <w:p>
+            <w:r>
+              <w:t>_(empty)_</w:t>
             </w:r>
           </w:p>
         </w:tc>
@@ -6262,17 +6678,17 @@
           </w:tcPr>
           <w:p>
             <w:r>
-              <w:t>HR_NOTIFICATION_EMAIL</w:t>
-            </w:r>
-          </w:p>
-        </w:tc>
-        <w:tc>
-          <w:tcPr>
-            <w:tcW w:type="dxa" w:w="2880"/>
-          </w:tcPr>
-          <w:p>
-            <w:r>
-              <w:t>Fallback HR notification recipient</w:t>
+              <w:t>DEVELOPER_OVERRIDE_USERS</w:t>
+            </w:r>
+          </w:p>
+        </w:tc>
+        <w:tc>
+          <w:tcPr>
+            <w:tcW w:type="dxa" w:w="2880"/>
+          </w:tcPr>
+          <w:p>
+            <w:r>
+              <w:t>Pipe-separated developer override account identifiers</w:t>
             </w:r>
           </w:p>
         </w:tc>
@@ -6294,27 +6710,27 @@
           </w:tcPr>
           <w:p>
             <w:r>
-              <w:t>ETHICS_NOTIFICATION_EMAIL</w:t>
-            </w:r>
-          </w:p>
-        </w:tc>
-        <w:tc>
-          <w:tcPr>
-            <w:tcW w:type="dxa" w:w="2880"/>
-          </w:tcPr>
-          <w:p>
-            <w:r>
-              <w:t>Ethics officer notification recipient</w:t>
-            </w:r>
-          </w:p>
-        </w:tc>
-        <w:tc>
-          <w:tcPr>
-            <w:tcW w:type="dxa" w:w="2880"/>
-          </w:tcPr>
-          <w:p>
-            <w:r>
-              <w:t>_(empty)_</w:t>
+              <w:t>SMTP_HOST</w:t>
+            </w:r>
+          </w:p>
+        </w:tc>
+        <w:tc>
+          <w:tcPr>
+            <w:tcW w:type="dxa" w:w="2880"/>
+          </w:tcPr>
+          <w:p>
+            <w:r>
+              <w:t>SMTP server hostname</w:t>
+            </w:r>
+          </w:p>
+        </w:tc>
+        <w:tc>
+          <w:tcPr>
+            <w:tcW w:type="dxa" w:w="2880"/>
+          </w:tcPr>
+          <w:p>
+            <w:r>
+              <w:t>localhost</w:t>
             </w:r>
           </w:p>
         </w:tc>
@@ -6326,6 +6742,294 @@
           </w:tcPr>
           <w:p>
             <w:r>
+              <w:t>SMTP_PORT</w:t>
+            </w:r>
+          </w:p>
+        </w:tc>
+        <w:tc>
+          <w:tcPr>
+            <w:tcW w:type="dxa" w:w="2880"/>
+          </w:tcPr>
+          <w:p>
+            <w:r>
+              <w:t>SMTP port (587 = STARTTLS, 465 = SMTPS)</w:t>
+            </w:r>
+          </w:p>
+        </w:tc>
+        <w:tc>
+          <w:tcPr>
+            <w:tcW w:type="dxa" w:w="2880"/>
+          </w:tcPr>
+          <w:p>
+            <w:r>
+              <w:t>587</w:t>
+            </w:r>
+          </w:p>
+        </w:tc>
+      </w:tr>
+      <w:tr>
+        <w:tc>
+          <w:tcPr>
+            <w:tcW w:type="dxa" w:w="2880"/>
+          </w:tcPr>
+          <w:p>
+            <w:r>
+              <w:t>SMTP_USERNAME</w:t>
+            </w:r>
+          </w:p>
+        </w:tc>
+        <w:tc>
+          <w:tcPr>
+            <w:tcW w:type="dxa" w:w="2880"/>
+          </w:tcPr>
+          <w:p>
+            <w:r>
+              <w:t>SMTP auth username</w:t>
+            </w:r>
+          </w:p>
+        </w:tc>
+        <w:tc>
+          <w:tcPr>
+            <w:tcW w:type="dxa" w:w="2880"/>
+          </w:tcPr>
+          <w:p>
+            <w:r>
+              <w:t>_(empty)_</w:t>
+            </w:r>
+          </w:p>
+        </w:tc>
+      </w:tr>
+      <w:tr>
+        <w:tc>
+          <w:tcPr>
+            <w:tcW w:type="dxa" w:w="2880"/>
+          </w:tcPr>
+          <w:p>
+            <w:r>
+              <w:t>SMTP_PASSWORD</w:t>
+            </w:r>
+          </w:p>
+        </w:tc>
+        <w:tc>
+          <w:tcPr>
+            <w:tcW w:type="dxa" w:w="2880"/>
+          </w:tcPr>
+          <w:p>
+            <w:r>
+              <w:t>SMTP auth password</w:t>
+            </w:r>
+          </w:p>
+        </w:tc>
+        <w:tc>
+          <w:tcPr>
+            <w:tcW w:type="dxa" w:w="2880"/>
+          </w:tcPr>
+          <w:p>
+            <w:r>
+              <w:t>_(empty)_</w:t>
+            </w:r>
+          </w:p>
+        </w:tc>
+      </w:tr>
+      <w:tr>
+        <w:tc>
+          <w:tcPr>
+            <w:tcW w:type="dxa" w:w="2880"/>
+          </w:tcPr>
+          <w:p>
+            <w:r>
+              <w:t>MAIL_FROM</w:t>
+            </w:r>
+          </w:p>
+        </w:tc>
+        <w:tc>
+          <w:tcPr>
+            <w:tcW w:type="dxa" w:w="2880"/>
+          </w:tcPr>
+          <w:p>
+            <w:r>
+              <w:t>Sender email address</w:t>
+            </w:r>
+          </w:p>
+        </w:tc>
+        <w:tc>
+          <w:tcPr>
+            <w:tcW w:type="dxa" w:w="2880"/>
+          </w:tcPr>
+          <w:p>
+            <w:r>
+              <w:t>noreply@localhost</w:t>
+            </w:r>
+          </w:p>
+        </w:tc>
+      </w:tr>
+      <w:tr>
+        <w:tc>
+          <w:tcPr>
+            <w:tcW w:type="dxa" w:w="2880"/>
+          </w:tcPr>
+          <w:p>
+            <w:r>
+              <w:t>MAIL_FROM_NAME</w:t>
+            </w:r>
+          </w:p>
+        </w:tc>
+        <w:tc>
+          <w:tcPr>
+            <w:tcW w:type="dxa" w:w="2880"/>
+          </w:tcPr>
+          <w:p>
+            <w:r>
+              <w:t>Sender display name</w:t>
+            </w:r>
+          </w:p>
+        </w:tc>
+        <w:tc>
+          <w:tcPr>
+            <w:tcW w:type="dxa" w:w="2880"/>
+          </w:tcPr>
+          <w:p>
+            <w:r>
+              <w:t>Voice Without Fear</w:t>
+            </w:r>
+          </w:p>
+        </w:tc>
+      </w:tr>
+      <w:tr>
+        <w:tc>
+          <w:tcPr>
+            <w:tcW w:type="dxa" w:w="2880"/>
+          </w:tcPr>
+          <w:p>
+            <w:r>
+              <w:t>HR_NOTIFICATION_EMAIL</w:t>
+            </w:r>
+          </w:p>
+        </w:tc>
+        <w:tc>
+          <w:tcPr>
+            <w:tcW w:type="dxa" w:w="2880"/>
+          </w:tcPr>
+          <w:p>
+            <w:r>
+              <w:t>Fallback HR notification recipient</w:t>
+            </w:r>
+          </w:p>
+        </w:tc>
+        <w:tc>
+          <w:tcPr>
+            <w:tcW w:type="dxa" w:w="2880"/>
+          </w:tcPr>
+          <w:p>
+            <w:r>
+              <w:t>_(empty)_</w:t>
+            </w:r>
+          </w:p>
+        </w:tc>
+      </w:tr>
+      <w:tr>
+        <w:tc>
+          <w:tcPr>
+            <w:tcW w:type="dxa" w:w="2880"/>
+          </w:tcPr>
+          <w:p>
+            <w:r>
+              <w:t>ETHICS_NOTIFICATION_EMAIL</w:t>
+            </w:r>
+          </w:p>
+        </w:tc>
+        <w:tc>
+          <w:tcPr>
+            <w:tcW w:type="dxa" w:w="2880"/>
+          </w:tcPr>
+          <w:p>
+            <w:r>
+              <w:t>Ethics officer notification recipient</w:t>
+            </w:r>
+          </w:p>
+        </w:tc>
+        <w:tc>
+          <w:tcPr>
+            <w:tcW w:type="dxa" w:w="2880"/>
+          </w:tcPr>
+          <w:p>
+            <w:r>
+              <w:t>_(empty)_</w:t>
+            </w:r>
+          </w:p>
+        </w:tc>
+      </w:tr>
+      <w:tr>
+        <w:tc>
+          <w:tcPr>
+            <w:tcW w:type="dxa" w:w="2880"/>
+          </w:tcPr>
+          <w:p>
+            <w:r>
+              <w:t>NOTIFICATIONS_IMMEDIATE_ENABLED</w:t>
+            </w:r>
+          </w:p>
+        </w:tc>
+        <w:tc>
+          <w:tcPr>
+            <w:tcW w:type="dxa" w:w="2880"/>
+          </w:tcPr>
+          <w:p>
+            <w:r>
+              <w:t>Enable immediate notifications</w:t>
+            </w:r>
+          </w:p>
+        </w:tc>
+        <w:tc>
+          <w:tcPr>
+            <w:tcW w:type="dxa" w:w="2880"/>
+          </w:tcPr>
+          <w:p>
+            <w:r>
+              <w:t>true</w:t>
+            </w:r>
+          </w:p>
+        </w:tc>
+      </w:tr>
+      <w:tr>
+        <w:tc>
+          <w:tcPr>
+            <w:tcW w:type="dxa" w:w="2880"/>
+          </w:tcPr>
+          <w:p>
+            <w:r>
+              <w:t>NOTIFICATIONS_SCHEDULED_ENABLED</w:t>
+            </w:r>
+          </w:p>
+        </w:tc>
+        <w:tc>
+          <w:tcPr>
+            <w:tcW w:type="dxa" w:w="2880"/>
+          </w:tcPr>
+          <w:p>
+            <w:r>
+              <w:t>Enable scheduler-driven notifications</w:t>
+            </w:r>
+          </w:p>
+        </w:tc>
+        <w:tc>
+          <w:tcPr>
+            <w:tcW w:type="dxa" w:w="2880"/>
+          </w:tcPr>
+          <w:p>
+            <w:r>
+              <w:t>true</w:t>
+            </w:r>
+          </w:p>
+        </w:tc>
+      </w:tr>
+      <w:tr>
+        <w:tc>
+          <w:tcPr>
+            <w:tcW w:type="dxa" w:w="2880"/>
+          </w:tcPr>
+          <w:p>
+            <w:r>
               <w:t>DEV_NOTIFICATION_EMAIL</w:t>
             </w:r>
           </w:p>
@@ -6347,6 +7051,38 @@
           <w:p>
             <w:r>
               <w:t>_(empty)_</w:t>
+            </w:r>
+          </w:p>
+        </w:tc>
+      </w:tr>
+      <w:tr>
+        <w:tc>
+          <w:tcPr>
+            <w:tcW w:type="dxa" w:w="2880"/>
+          </w:tcPr>
+          <w:p>
+            <w:r>
+              <w:t>MALWARE_SCANNER</w:t>
+            </w:r>
+          </w:p>
+        </w:tc>
+        <w:tc>
+          <w:tcPr>
+            <w:tcW w:type="dxa" w:w="2880"/>
+          </w:tcPr>
+          <w:p>
+            <w:r>
+              <w:t>Malware scanner mode (noop or clamav)</w:t>
+            </w:r>
+          </w:p>
+        </w:tc>
+        <w:tc>
+          <w:tcPr>
+            <w:tcW w:type="dxa" w:w="2880"/>
+          </w:tcPr>
+          <w:p>
+            <w:r>
+              <w:t>noop</w:t>
             </w:r>
           </w:p>
         </w:tc>

</xml_diff>

<commit_message>
docs: use CHAR(36) datatype in ER id fields
</commit_message>
<xml_diff>
--- a/TECHNICAL_DESIGN.docx
+++ b/TECHNICAL_DESIGN.docx
@@ -18,7 +18,7 @@
           <w:i/>
           <w:sz w:val="20"/>
         </w:rPr>
-        <w:t>Generated from TECHNICAL_DESIGN.md on 2026-05-06 09:16</w:t>
+        <w:t>Generated from TECHNICAL_DESIGN.md on 2026-05-06 09:22</w:t>
       </w:r>
     </w:p>
     <w:p>
@@ -648,7 +648,7 @@
         <w:br/>
         <w:t xml:space="preserve">  CATEGORIES {</w:t>
         <w:br/>
-        <w:t xml:space="preserve">    string id PK</w:t>
+        <w:t xml:space="preserve">    CHAR(36) id PK</w:t>
         <w:br/>
         <w:t xml:space="preserve">    string name</w:t>
         <w:br/>
@@ -660,7 +660,7 @@
         <w:br/>
         <w:t xml:space="preserve">  STATUSES {</w:t>
         <w:br/>
-        <w:t xml:space="preserve">    string id PK</w:t>
+        <w:t xml:space="preserve">    CHAR(36) id PK</w:t>
         <w:br/>
         <w:t xml:space="preserve">    string name</w:t>
         <w:br/>
@@ -672,7 +672,7 @@
         <w:br/>
         <w:t xml:space="preserve">  STAGES {</w:t>
         <w:br/>
-        <w:t xml:space="preserve">    string id PK</w:t>
+        <w:t xml:space="preserve">    CHAR(36) id PK</w:t>
         <w:br/>
         <w:t xml:space="preserve">    string name</w:t>
         <w:br/>
@@ -684,15 +684,15 @@
         <w:br/>
         <w:t xml:space="preserve">  FEEDBACKS {</w:t>
         <w:br/>
-        <w:t xml:space="preserve">    string id PK</w:t>
+        <w:t xml:space="preserve">    CHAR(36) id PK</w:t>
         <w:br/>
         <w:t xml:space="preserve">    string reference_no</w:t>
         <w:br/>
-        <w:t xml:space="preserve">    string category_id FK</w:t>
+        <w:t xml:space="preserve">    CHAR(36) category_id FK</w:t>
         <w:br/>
-        <w:t xml:space="preserve">    string status_id FK</w:t>
+        <w:t xml:space="preserve">    CHAR(36) status_id FK</w:t>
         <w:br/>
-        <w:t xml:space="preserve">    string stage_id FK</w:t>
+        <w:t xml:space="preserve">    CHAR(36) stage_id FK</w:t>
         <w:br/>
         <w:t xml:space="preserve">    string priority</w:t>
         <w:br/>
@@ -700,9 +700,9 @@
         <w:br/>
         <w:t xml:space="preserve">  REPORT_UPDATES {</w:t>
         <w:br/>
-        <w:t xml:space="preserve">    string id PK</w:t>
+        <w:t xml:space="preserve">    CHAR(36) id PK</w:t>
         <w:br/>
-        <w:t xml:space="preserve">    string feedback_id FK</w:t>
+        <w:t xml:space="preserve">    CHAR(36) feedback_id FK</w:t>
         <w:br/>
         <w:t xml:space="preserve">    string update_reference_no</w:t>
         <w:br/>
@@ -710,11 +710,11 @@
         <w:br/>
         <w:t xml:space="preserve">  ATTACHMENTS {</w:t>
         <w:br/>
-        <w:t xml:space="preserve">    string id PK</w:t>
+        <w:t xml:space="preserve">    CHAR(36) id PK</w:t>
         <w:br/>
-        <w:t xml:space="preserve">    string feedback_id FK</w:t>
+        <w:t xml:space="preserve">    CHAR(36) feedback_id FK</w:t>
         <w:br/>
-        <w:t xml:space="preserve">    string report_update_id FK</w:t>
+        <w:t xml:space="preserve">    CHAR(36) report_update_id FK</w:t>
         <w:br/>
         <w:t xml:space="preserve">    string stored_name</w:t>
         <w:br/>
@@ -724,9 +724,9 @@
         <w:br/>
         <w:t xml:space="preserve">  NOTIFICATIONS {</w:t>
         <w:br/>
-        <w:t xml:space="preserve">    string id PK</w:t>
+        <w:t xml:space="preserve">    CHAR(36) id PK</w:t>
         <w:br/>
-        <w:t xml:space="preserve">    string feedback_id FK</w:t>
+        <w:t xml:space="preserve">    CHAR(36) feedback_id FK</w:t>
         <w:br/>
         <w:t xml:space="preserve">    string kind</w:t>
         <w:br/>
@@ -736,11 +736,11 @@
         <w:br/>
         <w:t xml:space="preserve">  AUDIT_LOGS {</w:t>
         <w:br/>
-        <w:t xml:space="preserve">    string id PK</w:t>
+        <w:t xml:space="preserve">    CHAR(36) id PK</w:t>
         <w:br/>
-        <w:t xml:space="preserve">    string feedback_id FK</w:t>
+        <w:t xml:space="preserve">    CHAR(36) feedback_id FK</w:t>
         <w:br/>
-        <w:t xml:space="preserve">    string actor_user_id FK</w:t>
+        <w:t xml:space="preserve">    CHAR(36) actor_user_id FK</w:t>
         <w:br/>
         <w:t xml:space="preserve">    string action</w:t>
         <w:br/>
@@ -750,7 +750,7 @@
         <w:br/>
         <w:t xml:space="preserve">  USERS {</w:t>
         <w:br/>
-        <w:t xml:space="preserve">    string id PK</w:t>
+        <w:t xml:space="preserve">    CHAR(36) id PK</w:t>
         <w:br/>
         <w:t xml:space="preserve">    string email</w:t>
         <w:br/>
@@ -762,7 +762,7 @@
         <w:br/>
         <w:t xml:space="preserve">  LOGIN_ATTEMPTS {</w:t>
         <w:br/>
-        <w:t xml:space="preserve">    string id PK</w:t>
+        <w:t xml:space="preserve">    CHAR(36) id PK</w:t>
         <w:br/>
         <w:t xml:space="preserve">    string ip</w:t>
         <w:br/>

</xml_diff>

<commit_message>
docs: simplify ER char notation
</commit_message>
<xml_diff>
--- a/TECHNICAL_DESIGN.docx
+++ b/TECHNICAL_DESIGN.docx
@@ -18,7 +18,7 @@
           <w:i/>
           <w:sz w:val="20"/>
         </w:rPr>
-        <w:t>Generated from TECHNICAL_DESIGN.md on 2026-05-06 09:22</w:t>
+        <w:t>Generated from TECHNICAL_DESIGN.md on 2026-05-06 09:25</w:t>
       </w:r>
     </w:p>
     <w:p>
@@ -648,7 +648,7 @@
         <w:br/>
         <w:t xml:space="preserve">  CATEGORIES {</w:t>
         <w:br/>
-        <w:t xml:space="preserve">    CHAR(36) id PK</w:t>
+        <w:t xml:space="preserve">    CHAR id PK</w:t>
         <w:br/>
         <w:t xml:space="preserve">    string name</w:t>
         <w:br/>
@@ -660,7 +660,7 @@
         <w:br/>
         <w:t xml:space="preserve">  STATUSES {</w:t>
         <w:br/>
-        <w:t xml:space="preserve">    CHAR(36) id PK</w:t>
+        <w:t xml:space="preserve">    CHAR id PK</w:t>
         <w:br/>
         <w:t xml:space="preserve">    string name</w:t>
         <w:br/>
@@ -672,7 +672,7 @@
         <w:br/>
         <w:t xml:space="preserve">  STAGES {</w:t>
         <w:br/>
-        <w:t xml:space="preserve">    CHAR(36) id PK</w:t>
+        <w:t xml:space="preserve">    CHAR id PK</w:t>
         <w:br/>
         <w:t xml:space="preserve">    string name</w:t>
         <w:br/>
@@ -684,15 +684,15 @@
         <w:br/>
         <w:t xml:space="preserve">  FEEDBACKS {</w:t>
         <w:br/>
-        <w:t xml:space="preserve">    CHAR(36) id PK</w:t>
+        <w:t xml:space="preserve">    CHAR id PK</w:t>
         <w:br/>
         <w:t xml:space="preserve">    string reference_no</w:t>
         <w:br/>
-        <w:t xml:space="preserve">    CHAR(36) category_id FK</w:t>
+        <w:t xml:space="preserve">    CHAR category_id FK</w:t>
         <w:br/>
-        <w:t xml:space="preserve">    CHAR(36) status_id FK</w:t>
+        <w:t xml:space="preserve">    CHAR status_id FK</w:t>
         <w:br/>
-        <w:t xml:space="preserve">    CHAR(36) stage_id FK</w:t>
+        <w:t xml:space="preserve">    CHAR stage_id FK</w:t>
         <w:br/>
         <w:t xml:space="preserve">    string priority</w:t>
         <w:br/>
@@ -700,9 +700,9 @@
         <w:br/>
         <w:t xml:space="preserve">  REPORT_UPDATES {</w:t>
         <w:br/>
-        <w:t xml:space="preserve">    CHAR(36) id PK</w:t>
+        <w:t xml:space="preserve">    CHAR id PK</w:t>
         <w:br/>
-        <w:t xml:space="preserve">    CHAR(36) feedback_id FK</w:t>
+        <w:t xml:space="preserve">    CHAR feedback_id FK</w:t>
         <w:br/>
         <w:t xml:space="preserve">    string update_reference_no</w:t>
         <w:br/>
@@ -710,11 +710,11 @@
         <w:br/>
         <w:t xml:space="preserve">  ATTACHMENTS {</w:t>
         <w:br/>
-        <w:t xml:space="preserve">    CHAR(36) id PK</w:t>
+        <w:t xml:space="preserve">    CHAR id PK</w:t>
         <w:br/>
-        <w:t xml:space="preserve">    CHAR(36) feedback_id FK</w:t>
+        <w:t xml:space="preserve">    CHAR feedback_id FK</w:t>
         <w:br/>
-        <w:t xml:space="preserve">    CHAR(36) report_update_id FK</w:t>
+        <w:t xml:space="preserve">    CHAR report_update_id FK</w:t>
         <w:br/>
         <w:t xml:space="preserve">    string stored_name</w:t>
         <w:br/>
@@ -724,9 +724,9 @@
         <w:br/>
         <w:t xml:space="preserve">  NOTIFICATIONS {</w:t>
         <w:br/>
-        <w:t xml:space="preserve">    CHAR(36) id PK</w:t>
+        <w:t xml:space="preserve">    CHAR id PK</w:t>
         <w:br/>
-        <w:t xml:space="preserve">    CHAR(36) feedback_id FK</w:t>
+        <w:t xml:space="preserve">    CHAR feedback_id FK</w:t>
         <w:br/>
         <w:t xml:space="preserve">    string kind</w:t>
         <w:br/>
@@ -736,11 +736,11 @@
         <w:br/>
         <w:t xml:space="preserve">  AUDIT_LOGS {</w:t>
         <w:br/>
-        <w:t xml:space="preserve">    CHAR(36) id PK</w:t>
+        <w:t xml:space="preserve">    CHAR id PK</w:t>
         <w:br/>
-        <w:t xml:space="preserve">    CHAR(36) feedback_id FK</w:t>
+        <w:t xml:space="preserve">    CHAR feedback_id FK</w:t>
         <w:br/>
-        <w:t xml:space="preserve">    CHAR(36) actor_user_id FK</w:t>
+        <w:t xml:space="preserve">    CHAR actor_user_id FK</w:t>
         <w:br/>
         <w:t xml:space="preserve">    string action</w:t>
         <w:br/>
@@ -750,7 +750,7 @@
         <w:br/>
         <w:t xml:space="preserve">  USERS {</w:t>
         <w:br/>
-        <w:t xml:space="preserve">    CHAR(36) id PK</w:t>
+        <w:t xml:space="preserve">    CHAR id PK</w:t>
         <w:br/>
         <w:t xml:space="preserve">    string email</w:t>
         <w:br/>
@@ -762,7 +762,7 @@
         <w:br/>
         <w:t xml:space="preserve">  LOGIN_ATTEMPTS {</w:t>
         <w:br/>
-        <w:t xml:space="preserve">    CHAR(36) id PK</w:t>
+        <w:t xml:space="preserve">    CHAR id PK</w:t>
         <w:br/>
         <w:t xml:space="preserve">    string ip</w:t>
         <w:br/>

</xml_diff>